<commit_message>
user and developer guide update
</commit_message>
<xml_diff>
--- a/DEVELOPER_GUIDE_(UPDATED)V3.docx
+++ b/DEVELOPER_GUIDE_(UPDATED)V3.docx
@@ -36478,6 +36478,3788 @@
     <w:p>
       <w:r>
         <w:br w:type="page"/>
+      </w:r>
+    </w:p>
+    <w:p>
+      <w:r>
+        <w:br w:type="page"/>
+      </w:r>
+    </w:p>
+    <w:p>
+      <w:pPr>
+        <w:pStyle w:val="Heading1"/>
+      </w:pPr>
+      <w:r/>
+      <w:r>
+        <w:t>11. UI Design Principles</w:t>
+      </w:r>
+    </w:p>
+    <w:p>
+      <w:r>
+        <w:t xml:space="preserve">PSAT's v2 frontend is built on one architecture and one design system. This section distils the standing rules any contributor must follow when touching </w:t>
+      </w:r>
+      <w:r>
+        <w:rPr>
+          <w:rFonts w:ascii="Courier New" w:hAnsi="Courier New"/>
+          <w:color w:val="C53030"/>
+          <w:sz w:val="18"/>
+        </w:rPr>
+        <w:t>frontend/src/</w:t>
+      </w:r>
+      <w:r>
+        <w:t xml:space="preserve">. It is condensed from the full living rulebook, </w:t>
+      </w:r>
+      <w:r>
+        <w:rPr>
+          <w:rFonts w:ascii="Courier New" w:hAnsi="Courier New"/>
+          <w:color w:val="C53030"/>
+          <w:sz w:val="18"/>
+        </w:rPr>
+        <w:t>UI_V2_REDESIGN_GUIDE.md</w:t>
+      </w:r>
+      <w:r>
+        <w:t xml:space="preserve"> (repo root) — that file also carries the page-by-page migration log, the responsive-unit conversion catalogue, and dated implementation history; treat it as the canonical, up-to-date source and this section as the quick reference.</w:t>
+      </w:r>
+    </w:p>
+    <w:p>
+      <w:pPr>
+        <w:pBdr>
+          <w:bottom w:val="single" w:sz="6" w:space="1" w:color="CCCCCC"/>
+        </w:pBdr>
+        <w:spacing w:after="0"/>
+      </w:pPr>
+    </w:p>
+    <w:p>
+      <w:pPr>
+        <w:pStyle w:val="Heading2"/>
+      </w:pPr>
+      <w:r/>
+      <w:r>
+        <w:t>Table of Contents</w:t>
+      </w:r>
+    </w:p>
+    <w:p>
+      <w:pPr>
+        <w:pBdr>
+          <w:bottom w:val="single" w:sz="6" w:space="1" w:color="CCCCCC"/>
+        </w:pBdr>
+        <w:spacing w:after="0"/>
+      </w:pPr>
+    </w:p>
+    <w:p>
+      <w:pPr>
+        <w:pStyle w:val="Heading2"/>
+      </w:pPr>
+      <w:r/>
+      <w:r>
+        <w:t>11.1 Why this section exists</w:t>
+      </w:r>
+    </w:p>
+    <w:p>
+      <w:r>
+        <w:t xml:space="preserve">Most damage to a design system comes not from big rewrites but from small, well-meaning drive-by changes — a button dropped straight into a layout, a hardcoded hex, a bespoke switch, an </w:t>
+      </w:r>
+      <w:r>
+        <w:rPr>
+          <w:rFonts w:ascii="Courier New" w:hAnsi="Courier New"/>
+          <w:color w:val="C53030"/>
+          <w:sz w:val="18"/>
+        </w:rPr>
+        <w:t>onClick</w:t>
+      </w:r>
+      <w:r>
+        <w:t xml:space="preserve"> that calls an API directly. Each change is individually harmless and collectively turns the codebase back into spaghetti. The rules below exist to stop that; “it's just a small change” is exactly the case they're for.</w:t>
+      </w:r>
+    </w:p>
+    <w:p>
+      <w:pPr>
+        <w:pStyle w:val="Heading2"/>
+      </w:pPr>
+      <w:r/>
+      <w:r>
+        <w:t>11.2 The Ten Rules</w:t>
+      </w:r>
+    </w:p>
+    <w:p>
+      <w:r>
+        <w:rPr>
+          <w:b w:val="0"/>
+        </w:rPr>
+        <w:t xml:space="preserve">1. </w:t>
+      </w:r>
+      <w:r>
+        <w:rPr>
+          <w:b/>
+        </w:rPr>
+        <w:t>The container/shell seam is law.</w:t>
+      </w:r>
+      <w:r>
+        <w:t xml:space="preserve"> Every redesigned page is a container (the page file, e.g. </w:t>
+      </w:r>
+      <w:r>
+        <w:rPr>
+          <w:rFonts w:ascii="Courier New" w:hAnsi="Courier New"/>
+          <w:color w:val="C53030"/>
+          <w:sz w:val="18"/>
+        </w:rPr>
+        <w:t>treatmentDetailPage.tsx</w:t>
+      </w:r>
+      <w:r>
+        <w:t xml:space="preserve">) that owns all logic — data fetching, hooks, </w:t>
+      </w:r>
+      <w:r>
+        <w:rPr>
+          <w:rFonts w:ascii="Courier New" w:hAnsi="Courier New"/>
+          <w:color w:val="C53030"/>
+          <w:sz w:val="18"/>
+        </w:rPr>
+        <w:t>useState</w:t>
+      </w:r>
+      <w:r>
+        <w:t xml:space="preserve"> for server data, sessionStorage, </w:t>
+      </w:r>
+      <w:r>
+        <w:rPr>
+          <w:rFonts w:ascii="Courier New" w:hAnsi="Courier New"/>
+          <w:color w:val="C53030"/>
+          <w:sz w:val="18"/>
+        </w:rPr>
+        <w:t>projectDataCache</w:t>
+      </w:r>
+      <w:r>
+        <w:t>, every callback — and assembles it into one typed view-model (</w:t>
+      </w:r>
+      <w:r>
+        <w:rPr>
+          <w:rFonts w:ascii="Courier New" w:hAnsi="Courier New"/>
+          <w:color w:val="C53030"/>
+          <w:sz w:val="18"/>
+        </w:rPr>
+        <w:t>*ViewModel.ts</w:t>
+      </w:r>
+      <w:r>
+        <w:t>). The shell (</w:t>
+      </w:r>
+      <w:r>
+        <w:rPr>
+          <w:rFonts w:ascii="Courier New" w:hAnsi="Courier New"/>
+          <w:color w:val="C53030"/>
+          <w:sz w:val="18"/>
+        </w:rPr>
+        <w:t>*LayoutV2.tsx</w:t>
+      </w:r>
+      <w:r>
+        <w:t>) is a pure function of that view-model. See §11.4.</w:t>
+      </w:r>
+    </w:p>
+    <w:p>
+      <w:r>
+        <w:rPr>
+          <w:b w:val="0"/>
+        </w:rPr>
+        <w:t xml:space="preserve">2. </w:t>
+      </w:r>
+      <w:r>
+        <w:rPr>
+          <w:b/>
+        </w:rPr>
+        <w:t>A shell may never fetch, own server state, or touch sessionStorage.</w:t>
+      </w:r>
+      <w:r>
+        <w:t xml:space="preserve"> Local presentational state (an accordion's open/closed, a hovered bar) is fine; anything that survives a remount or hits the network belongs in the container.</w:t>
+      </w:r>
+    </w:p>
+    <w:p>
+      <w:r>
+        <w:rPr>
+          <w:b w:val="0"/>
+        </w:rPr>
+        <w:t xml:space="preserve">3. </w:t>
+      </w:r>
+      <w:r>
+        <w:rPr>
+          <w:b/>
+        </w:rPr>
+        <w:t>Never “just add a button.”</w:t>
+      </w:r>
+      <w:r>
+        <w:t xml:space="preserve"> A new control must call a view-model callback (or dispatch an established </w:t>
+      </w:r>
+      <w:r>
+        <w:rPr>
+          <w:rFonts w:ascii="Courier New" w:hAnsi="Courier New"/>
+          <w:color w:val="C53030"/>
+          <w:sz w:val="18"/>
+        </w:rPr>
+        <w:t>window</w:t>
+      </w:r>
+      <w:r>
+        <w:t xml:space="preserve"> event: </w:t>
+      </w:r>
+      <w:r>
+        <w:rPr>
+          <w:rFonts w:ascii="Courier New" w:hAnsi="Courier New"/>
+          <w:color w:val="C53030"/>
+          <w:sz w:val="18"/>
+        </w:rPr>
+        <w:t>psat:save</w:t>
+      </w:r>
+      <w:r>
+        <w:t xml:space="preserve">, </w:t>
+      </w:r>
+      <w:r>
+        <w:rPr>
+          <w:rFonts w:ascii="Courier New" w:hAnsi="Courier New"/>
+          <w:color w:val="C53030"/>
+          <w:sz w:val="18"/>
+        </w:rPr>
+        <w:t>psat:discard</w:t>
+      </w:r>
+      <w:r>
+        <w:t xml:space="preserve">, </w:t>
+      </w:r>
+      <w:r>
+        <w:rPr>
+          <w:rFonts w:ascii="Courier New" w:hAnsi="Courier New"/>
+          <w:color w:val="C53030"/>
+          <w:sz w:val="18"/>
+        </w:rPr>
+        <w:t>psat:autocode:one</w:t>
+      </w:r>
+      <w:r>
+        <w:t xml:space="preserve">, </w:t>
+      </w:r>
+      <w:r>
+        <w:rPr>
+          <w:rFonts w:ascii="Courier New" w:hAnsi="Courier New"/>
+          <w:color w:val="C53030"/>
+          <w:sz w:val="18"/>
+        </w:rPr>
+        <w:t>psat:autocode:by-field</w:t>
+      </w:r>
+      <w:r>
+        <w:t xml:space="preserve">, </w:t>
+      </w:r>
+      <w:r>
+        <w:rPr>
+          <w:rFonts w:ascii="Courier New" w:hAnsi="Courier New"/>
+          <w:color w:val="C53030"/>
+          <w:sz w:val="18"/>
+        </w:rPr>
+        <w:t>psat:treat:all:completed</w:t>
+      </w:r>
+      <w:r>
+        <w:t xml:space="preserve">, …). If the callback doesn't exist yet, add it to the container and the </w:t>
+      </w:r>
+      <w:r>
+        <w:rPr>
+          <w:rFonts w:ascii="Courier New" w:hAnsi="Courier New"/>
+          <w:color w:val="C53030"/>
+          <w:sz w:val="18"/>
+        </w:rPr>
+        <w:t>*ViewModel.ts</w:t>
+      </w:r>
+      <w:r>
+        <w:t xml:space="preserve"> interface, then consume it in the shell.</w:t>
+      </w:r>
+    </w:p>
+    <w:p>
+      <w:r>
+        <w:rPr>
+          <w:b w:val="0"/>
+        </w:rPr>
+        <w:t xml:space="preserve">4. </w:t>
+      </w:r>
+      <w:r>
+        <w:rPr>
+          <w:b/>
+        </w:rPr>
+        <w:t>Reuse the shared primitives; do not reinvent chrome.</w:t>
+      </w:r>
+      <w:r>
+        <w:t xml:space="preserve"> Canonical implementations live in </w:t>
+      </w:r>
+      <w:r>
+        <w:rPr>
+          <w:rFonts w:ascii="Courier New" w:hAnsi="Courier New"/>
+          <w:color w:val="C53030"/>
+          <w:sz w:val="18"/>
+        </w:rPr>
+        <w:t>frontend/src/pages/PathAnalysisPage/components/paV2Primitives.tsx</w:t>
+      </w:r>
+      <w:r>
+        <w:t xml:space="preserve"> (</w:t>
+      </w:r>
+      <w:r>
+        <w:rPr>
+          <w:rFonts w:ascii="Courier New" w:hAnsi="Courier New"/>
+          <w:color w:val="C53030"/>
+          <w:sz w:val="18"/>
+        </w:rPr>
+        <w:t>V2Switch</w:t>
+      </w:r>
+      <w:r>
+        <w:t xml:space="preserve">, </w:t>
+      </w:r>
+      <w:r>
+        <w:rPr>
+          <w:rFonts w:ascii="Courier New" w:hAnsi="Courier New"/>
+          <w:color w:val="C53030"/>
+          <w:sz w:val="18"/>
+        </w:rPr>
+        <w:t>V2Segmented</w:t>
+      </w:r>
+      <w:r>
+        <w:t xml:space="preserve">, </w:t>
+      </w:r>
+      <w:r>
+        <w:rPr>
+          <w:rFonts w:ascii="Courier New" w:hAnsi="Courier New"/>
+          <w:color w:val="C53030"/>
+          <w:sz w:val="18"/>
+        </w:rPr>
+        <w:t>v2TabStyle</w:t>
+      </w:r>
+      <w:r>
+        <w:t xml:space="preserve">, </w:t>
+      </w:r>
+      <w:r>
+        <w:rPr>
+          <w:rFonts w:ascii="Courier New" w:hAnsi="Courier New"/>
+          <w:color w:val="C53030"/>
+          <w:sz w:val="18"/>
+        </w:rPr>
+        <w:t>v2TabRowStyle</w:t>
+      </w:r>
+      <w:r>
+        <w:t xml:space="preserve">, </w:t>
+      </w:r>
+      <w:r>
+        <w:rPr>
+          <w:rFonts w:ascii="Courier New" w:hAnsi="Courier New"/>
+          <w:color w:val="C53030"/>
+          <w:sz w:val="18"/>
+        </w:rPr>
+        <w:t>v2CardStyle</w:t>
+      </w:r>
+      <w:r>
+        <w:t xml:space="preserve">, </w:t>
+      </w:r>
+      <w:r>
+        <w:rPr>
+          <w:rFonts w:ascii="Courier New" w:hAnsi="Courier New"/>
+          <w:color w:val="C53030"/>
+          <w:sz w:val="18"/>
+        </w:rPr>
+        <w:t>AccordionSection</w:t>
+      </w:r>
+      <w:r>
+        <w:t xml:space="preserve">, </w:t>
+      </w:r>
+      <w:r>
+        <w:rPr>
+          <w:rFonts w:ascii="Courier New" w:hAnsi="Courier New"/>
+          <w:color w:val="C53030"/>
+          <w:sz w:val="18"/>
+        </w:rPr>
+        <w:t>DistTooltipBox</w:t>
+      </w:r>
+      <w:r>
+        <w:t xml:space="preserve">) and </w:t>
+      </w:r>
+      <w:r>
+        <w:rPr>
+          <w:rFonts w:ascii="Courier New" w:hAnsi="Courier New"/>
+          <w:color w:val="C53030"/>
+          <w:sz w:val="18"/>
+        </w:rPr>
+        <w:t>frontend/src/features/ui/designTokens.ts</w:t>
+      </w:r>
+      <w:r>
+        <w:t>.</w:t>
+      </w:r>
+    </w:p>
+    <w:p>
+      <w:r>
+        <w:rPr>
+          <w:b w:val="0"/>
+        </w:rPr>
+        <w:t xml:space="preserve">5. </w:t>
+      </w:r>
+      <w:r>
+        <w:rPr>
+          <w:b/>
+        </w:rPr>
+        <w:t>Tokens, never magic values.</w:t>
+      </w:r>
+      <w:r>
+        <w:t xml:space="preserve"> All colour/spacing/radius/type come from </w:t>
+      </w:r>
+      <w:r>
+        <w:rPr>
+          <w:rFonts w:ascii="Courier New" w:hAnsi="Courier New"/>
+          <w:color w:val="C53030"/>
+          <w:sz w:val="18"/>
+        </w:rPr>
+        <w:t>designTokens.ts</w:t>
+      </w:r>
+      <w:r>
+        <w:t xml:space="preserve"> (</w:t>
+      </w:r>
+      <w:r>
+        <w:rPr>
+          <w:rFonts w:ascii="Courier New" w:hAnsi="Courier New"/>
+          <w:color w:val="C53030"/>
+          <w:sz w:val="18"/>
+        </w:rPr>
+        <w:t>COLOR</w:t>
+      </w:r>
+      <w:r>
+        <w:t xml:space="preserve">, </w:t>
+      </w:r>
+      <w:r>
+        <w:rPr>
+          <w:rFonts w:ascii="Courier New" w:hAnsi="Courier New"/>
+          <w:color w:val="C53030"/>
+          <w:sz w:val="18"/>
+        </w:rPr>
+        <w:t>FONT</w:t>
+      </w:r>
+      <w:r>
+        <w:t xml:space="preserve">, </w:t>
+      </w:r>
+      <w:r>
+        <w:rPr>
+          <w:rFonts w:ascii="Courier New" w:hAnsi="Courier New"/>
+          <w:color w:val="C53030"/>
+          <w:sz w:val="18"/>
+        </w:rPr>
+        <w:t>RADIUS</w:t>
+      </w:r>
+      <w:r>
+        <w:t xml:space="preserve">, </w:t>
+      </w:r>
+      <w:r>
+        <w:rPr>
+          <w:rFonts w:ascii="Courier New" w:hAnsi="Courier New"/>
+          <w:color w:val="C53030"/>
+          <w:sz w:val="18"/>
+        </w:rPr>
+        <w:t>CONTENT_PADDING</w:t>
+      </w:r>
+      <w:r>
+        <w:t xml:space="preserve">, </w:t>
+      </w:r>
+      <w:r>
+        <w:rPr>
+          <w:rFonts w:ascii="Courier New" w:hAnsi="Courier New"/>
+          <w:color w:val="C53030"/>
+          <w:sz w:val="18"/>
+        </w:rPr>
+        <w:t>CATEGORICAL</w:t>
+      </w:r>
+      <w:r>
+        <w:t xml:space="preserve">), </w:t>
+      </w:r>
+      <w:r>
+        <w:rPr>
+          <w:rFonts w:ascii="Courier New" w:hAnsi="Courier New"/>
+          <w:color w:val="C53030"/>
+          <w:sz w:val="18"/>
+        </w:rPr>
+        <w:t>DESIGN_GUIDE.md</w:t>
+      </w:r>
+      <w:r>
+        <w:t xml:space="preserve">, and </w:t>
+      </w:r>
+      <w:r>
+        <w:rPr>
+          <w:rFonts w:ascii="Courier New" w:hAnsi="Courier New"/>
+          <w:color w:val="C53030"/>
+          <w:sz w:val="18"/>
+        </w:rPr>
+        <w:t>colorConstants.ts</w:t>
+      </w:r>
+      <w:r>
+        <w:t xml:space="preserve"> (risk-band hues). Never write a raw hex (especially </w:t>
+      </w:r>
+      <w:r>
+        <w:rPr>
+          <w:rFonts w:ascii="Courier New" w:hAnsi="Courier New"/>
+          <w:color w:val="C53030"/>
+          <w:sz w:val="18"/>
+        </w:rPr>
+        <w:t>#000</w:t>
+      </w:r>
+      <w:r>
+        <w:t xml:space="preserve"> — darkest text is </w:t>
+      </w:r>
+      <w:r>
+        <w:rPr>
+          <w:rFonts w:ascii="Courier New" w:hAnsi="Courier New"/>
+          <w:color w:val="C53030"/>
+          <w:sz w:val="18"/>
+        </w:rPr>
+        <w:t>#2D3748</w:t>
+      </w:r>
+      <w:r>
+        <w:t>).</w:t>
+      </w:r>
+    </w:p>
+    <w:p>
+      <w:r>
+        <w:rPr>
+          <w:b w:val="0"/>
+        </w:rPr>
+        <w:t xml:space="preserve">6. </w:t>
+      </w:r>
+      <w:r>
+        <w:rPr>
+          <w:b/>
+        </w:rPr>
+        <w:t>Scope = colour, and it is meaningful.</w:t>
+      </w:r>
+      <w:r>
+        <w:t xml:space="preserve"> Blue </w:t>
+      </w:r>
+      <w:r>
+        <w:rPr>
+          <w:rFonts w:ascii="Courier New" w:hAnsi="Courier New"/>
+          <w:color w:val="C53030"/>
+          <w:sz w:val="18"/>
+        </w:rPr>
+        <w:t>#3182CE</w:t>
+      </w:r>
+      <w:r>
+        <w:t xml:space="preserve"> = local action (acts on one segment/selection). Teal </w:t>
+      </w:r>
+      <w:r>
+        <w:rPr>
+          <w:rFonts w:ascii="Courier New" w:hAnsi="Courier New"/>
+          <w:color w:val="C53030"/>
+          <w:sz w:val="18"/>
+        </w:rPr>
+        <w:t>#319795</w:t>
+      </w:r>
+      <w:r>
+        <w:t xml:space="preserve"> = global action (acts on the whole project / all projects). A primary button's colour must match its scope.</w:t>
+      </w:r>
+    </w:p>
+    <w:p>
+      <w:r>
+        <w:rPr>
+          <w:b w:val="0"/>
+        </w:rPr>
+        <w:t xml:space="preserve">7. </w:t>
+      </w:r>
+      <w:r>
+        <w:rPr>
+          <w:b/>
+        </w:rPr>
+        <w:t>Shared heavy components use the gated variant pattern.</w:t>
+      </w:r>
+      <w:r>
+        <w:t xml:space="preserve"> When one component serves both UIs (</w:t>
+      </w:r>
+      <w:r>
+        <w:rPr>
+          <w:rFonts w:ascii="Courier New" w:hAnsi="Courier New"/>
+          <w:color w:val="C53030"/>
+          <w:sz w:val="18"/>
+        </w:rPr>
+        <w:t>GeoDataPanel</w:t>
+      </w:r>
+      <w:r>
+        <w:t xml:space="preserve">, </w:t>
+      </w:r>
+      <w:r>
+        <w:rPr>
+          <w:rFonts w:ascii="Courier New" w:hAnsi="Courier New"/>
+          <w:color w:val="C53030"/>
+          <w:sz w:val="18"/>
+        </w:rPr>
+        <w:t>AttributesPanel</w:t>
+      </w:r>
+      <w:r>
+        <w:t xml:space="preserve">, </w:t>
+      </w:r>
+      <w:r>
+        <w:rPr>
+          <w:rFonts w:ascii="Courier New" w:hAnsi="Courier New"/>
+          <w:color w:val="C53030"/>
+          <w:sz w:val="18"/>
+        </w:rPr>
+        <w:t>PathAnalysisMapView</w:t>
+      </w:r>
+      <w:r>
+        <w:t xml:space="preserve">, </w:t>
+      </w:r>
+      <w:r>
+        <w:rPr>
+          <w:rFonts w:ascii="Courier New" w:hAnsi="Courier New"/>
+          <w:color w:val="C53030"/>
+          <w:sz w:val="18"/>
+        </w:rPr>
+        <w:t>FilterPanel</w:t>
+      </w:r>
+      <w:r>
+        <w:t xml:space="preserve">, </w:t>
+      </w:r>
+      <w:r>
+        <w:rPr>
+          <w:rFonts w:ascii="Courier New" w:hAnsi="Courier New"/>
+          <w:color w:val="C53030"/>
+          <w:sz w:val="18"/>
+        </w:rPr>
+        <w:t>AggregatedScoreBandPanel</w:t>
+      </w:r>
+      <w:r>
+        <w:t xml:space="preserve">, </w:t>
+      </w:r>
+      <w:r>
+        <w:rPr>
+          <w:rFonts w:ascii="Courier New" w:hAnsi="Courier New"/>
+          <w:color w:val="C53030"/>
+          <w:sz w:val="18"/>
+        </w:rPr>
+        <w:t>AggregatedTopContributorsPanel</w:t>
+      </w:r>
+      <w:r>
+        <w:t xml:space="preserve">, </w:t>
+      </w:r>
+      <w:r>
+        <w:rPr>
+          <w:rFonts w:ascii="Courier New" w:hAnsi="Courier New"/>
+          <w:color w:val="C53030"/>
+          <w:sz w:val="18"/>
+        </w:rPr>
+        <w:t>AttributeDistributionChart</w:t>
+      </w:r>
+      <w:r>
+        <w:t xml:space="preserve">, </w:t>
+      </w:r>
+      <w:r>
+        <w:rPr>
+          <w:rFonts w:ascii="Courier New" w:hAnsi="Courier New"/>
+          <w:color w:val="C53030"/>
+          <w:sz w:val="18"/>
+        </w:rPr>
+        <w:t>AutocodeValidation</w:t>
+      </w:r>
+      <w:r>
+        <w:t xml:space="preserve">, </w:t>
+      </w:r>
+      <w:r>
+        <w:rPr>
+          <w:rFonts w:ascii="Courier New" w:hAnsi="Courier New"/>
+          <w:color w:val="C53030"/>
+          <w:sz w:val="18"/>
+        </w:rPr>
+        <w:t>SelectRoadsMap</w:t>
+      </w:r>
+      <w:r>
+        <w:t xml:space="preserve">, </w:t>
+      </w:r>
+      <w:r>
+        <w:rPr>
+          <w:rFonts w:ascii="Courier New" w:hAnsi="Courier New"/>
+          <w:color w:val="C53030"/>
+          <w:sz w:val="18"/>
+        </w:rPr>
+        <w:t>AnalysisSidebar</w:t>
+      </w:r>
+      <w:r>
+        <w:t xml:space="preserve">, </w:t>
+      </w:r>
+      <w:r>
+        <w:rPr>
+          <w:rFonts w:ascii="Courier New" w:hAnsi="Courier New"/>
+          <w:color w:val="C53030"/>
+          <w:sz w:val="18"/>
+        </w:rPr>
+        <w:t>ImagePanel</w:t>
+      </w:r>
+      <w:r>
+        <w:t xml:space="preserve">), add a </w:t>
+      </w:r>
+      <w:r>
+        <w:rPr>
+          <w:rFonts w:ascii="Courier New" w:hAnsi="Courier New"/>
+          <w:color w:val="C53030"/>
+          <w:sz w:val="18"/>
+        </w:rPr>
+        <w:t>variant</w:t>
+      </w:r>
+      <w:r>
+        <w:t xml:space="preserve"> branch with default </w:t>
+      </w:r>
+      <w:r>
+        <w:rPr>
+          <w:rFonts w:ascii="Courier New" w:hAnsi="Courier New"/>
+          <w:color w:val="C53030"/>
+          <w:sz w:val="18"/>
+        </w:rPr>
+        <w:t>"v1"</w:t>
+      </w:r>
+      <w:r>
+        <w:t xml:space="preserve"> that stays byte-identical.</w:t>
+      </w:r>
+    </w:p>
+    <w:p>
+      <w:r>
+        <w:rPr>
+          <w:b w:val="0"/>
+        </w:rPr>
+        <w:t xml:space="preserve">8. </w:t>
+      </w:r>
+      <w:r>
+        <w:rPr>
+          <w:b/>
+        </w:rPr>
+        <w:t>Every distribution readout uses the shared tooltip component.</w:t>
+      </w:r>
+      <w:r>
+        <w:t xml:space="preserve"> Any hover that reveals count/% on a pie, bar, or stacked band renders the shared </w:t>
+      </w:r>
+      <w:r>
+        <w:rPr>
+          <w:rFonts w:ascii="Courier New" w:hAnsi="Courier New"/>
+          <w:color w:val="C53030"/>
+          <w:sz w:val="18"/>
+        </w:rPr>
+        <w:t>DistTooltipBox</w:t>
+      </w:r>
+      <w:r>
+        <w:t xml:space="preserve">. The native </w:t>
+      </w:r>
+      <w:r>
+        <w:rPr>
+          <w:rFonts w:ascii="Courier New" w:hAnsi="Courier New"/>
+          <w:color w:val="C53030"/>
+          <w:sz w:val="18"/>
+        </w:rPr>
+        <w:t>title</w:t>
+      </w:r>
+      <w:r>
+        <w:t xml:space="preserve"> attribute is allowed only for text-truncation reveals and simple affordance hints.</w:t>
+      </w:r>
+    </w:p>
+    <w:p>
+      <w:r>
+        <w:rPr>
+          <w:b w:val="0"/>
+        </w:rPr>
+        <w:t xml:space="preserve">9. </w:t>
+      </w:r>
+      <w:r>
+        <w:rPr>
+          <w:b/>
+        </w:rPr>
+        <w:t>Cross-page contracts are sacred.</w:t>
+      </w:r>
+      <w:r>
+        <w:t xml:space="preserve"> sessionStorage keys, </w:t>
+      </w:r>
+      <w:r>
+        <w:rPr>
+          <w:rFonts w:ascii="Courier New" w:hAnsi="Courier New"/>
+          <w:color w:val="C53030"/>
+          <w:sz w:val="18"/>
+        </w:rPr>
+        <w:t>projectDataCache</w:t>
+      </w:r>
+      <w:r>
+        <w:t xml:space="preserve"> invalidation, navigation </w:t>
+      </w:r>
+      <w:r>
+        <w:rPr>
+          <w:rFonts w:ascii="Courier New" w:hAnsi="Courier New"/>
+          <w:color w:val="C53030"/>
+          <w:sz w:val="18"/>
+        </w:rPr>
+        <w:t>state</w:t>
+      </w:r>
+      <w:r>
+        <w:t xml:space="preserve"> handshakes (centralised in </w:t>
+      </w:r>
+      <w:r>
+        <w:rPr>
+          <w:rFonts w:ascii="Courier New" w:hAnsi="Courier New"/>
+          <w:color w:val="C53030"/>
+          <w:sz w:val="18"/>
+        </w:rPr>
+        <w:t>frontend/src/features/projectNav.ts</w:t>
+      </w:r>
+      <w:r>
+        <w:t xml:space="preserve">), and route params are load-bearing and documented in the root </w:t>
+      </w:r>
+      <w:r>
+        <w:rPr>
+          <w:rFonts w:ascii="Courier New" w:hAnsi="Courier New"/>
+          <w:color w:val="C53030"/>
+          <w:sz w:val="18"/>
+        </w:rPr>
+        <w:t>CLAUDE.md</w:t>
+      </w:r>
+      <w:r>
+        <w:t>.</w:t>
+      </w:r>
+    </w:p>
+    <w:p>
+      <w:r>
+        <w:rPr>
+          <w:b w:val="0"/>
+        </w:rPr>
+        <w:t xml:space="preserve">10. </w:t>
+      </w:r>
+      <w:r>
+        <w:rPr>
+          <w:b/>
+        </w:rPr>
+        <w:t>Unsaved work is guarded honestly.</w:t>
+      </w:r>
+      <w:r>
+        <w:t xml:space="preserve"> A page that mutates persisted data sets </w:t>
+      </w:r>
+      <w:r>
+        <w:rPr>
+          <w:rFonts w:ascii="Courier New" w:hAnsi="Courier New"/>
+          <w:color w:val="C53030"/>
+          <w:sz w:val="18"/>
+        </w:rPr>
+        <w:t>window.psat_hasUnsavedChanges</w:t>
+      </w:r>
+      <w:r>
+        <w:t xml:space="preserve"> only when there is genuinely-unpersisted work, and listens for </w:t>
+      </w:r>
+      <w:r>
+        <w:rPr>
+          <w:rFonts w:ascii="Courier New" w:hAnsi="Courier New"/>
+          <w:color w:val="C53030"/>
+          <w:sz w:val="18"/>
+        </w:rPr>
+        <w:t>psat:save</w:t>
+      </w:r>
+      <w:r>
+        <w:t xml:space="preserve"> / </w:t>
+      </w:r>
+      <w:r>
+        <w:rPr>
+          <w:rFonts w:ascii="Courier New" w:hAnsi="Courier New"/>
+          <w:color w:val="C53030"/>
+          <w:sz w:val="18"/>
+        </w:rPr>
+        <w:t>psat:discard</w:t>
+      </w:r>
+      <w:r>
+        <w:t>. Do not set the flag “just in case.”</w:t>
+      </w:r>
+    </w:p>
+    <w:p>
+      <w:pPr>
+        <w:pStyle w:val="Heading2"/>
+      </w:pPr>
+      <w:r/>
+      <w:r>
+        <w:t>11.3 What the v2 redesign is (and isn't)</w:t>
+      </w:r>
+    </w:p>
+    <w:p>
+      <w:pPr>
+        <w:pStyle w:val="ListBullet"/>
+      </w:pPr>
+      <w:r>
+        <w:rPr>
+          <w:b/>
+        </w:rPr>
+        <w:t>Is:</w:t>
+      </w:r>
+      <w:r>
+        <w:t xml:space="preserve"> the same components (plus a few new ones) in a new arrangement, on the same routes. Plus app-global changes — a light-only theme (dark mode removed) and a restructured sidebar with route-specific controls moved onto each page's canvas.</w:t>
+      </w:r>
+    </w:p>
+    <w:p>
+      <w:pPr>
+        <w:pStyle w:val="ListBullet"/>
+      </w:pPr>
+      <w:r>
+        <w:rPr>
+          <w:b/>
+        </w:rPr>
+        <w:t>Isn't:</w:t>
+      </w:r>
+      <w:r>
+        <w:t xml:space="preserve"> a rewrite of the underlying components, and not a set of duplicate </w:t>
+      </w:r>
+      <w:r>
+        <w:rPr>
+          <w:rFonts w:ascii="Courier New" w:hAnsi="Courier New"/>
+          <w:color w:val="C53030"/>
+          <w:sz w:val="18"/>
+        </w:rPr>
+        <w:t>/new/*</w:t>
+      </w:r>
+      <w:r>
+        <w:t xml:space="preserve"> routes. There are no parallel routes.</w:t>
+      </w:r>
+    </w:p>
+    <w:p>
+      <w:r>
+        <w:rPr>
+          <w:b/>
+        </w:rPr>
+        <w:t>Mental model — siblings, not layers.</w:t>
+      </w:r>
+      <w:r>
+        <w:t xml:space="preserve"> v2 does not load v1 underneath and re-skin it. v1 and v2 are interchangeable siblings; exactly one renders at a time. They share the container above them, never each other:</w:t>
+      </w:r>
+    </w:p>
+    <w:p>
+      <w:pPr>
+        <w:spacing w:before="80" w:after="80"/>
+        <w:ind w:left="432"/>
+        <w:shd w:val="clear" w:color="auto" w:fill="1A202C"/>
+      </w:pPr>
+      <w:r>
+        <w:rPr>
+          <w:rFonts w:ascii="Courier New" w:hAnsi="Courier New"/>
+          <w:color w:val="F1F5F9"/>
+          <w:sz w:val="18"/>
+        </w:rPr>
+        <w:t xml:space="preserve">ProjectsContainer  (logic: fetch, hooks, sessionStorage, callbacks)</w:t>
+        <w:br/>
+        <w:t xml:space="preserve">        |  assembles ONE typed props object (the view-model)</w:t>
+        <w:br/>
+        <w:t xml:space="preserve">        |</w:t>
+        <w:br/>
+        <w:t xml:space="preserve">        +-- useUiVersion() === 'v1'  -&gt;  &lt;ProjectsLayoutV1 {...vm} /&gt;</w:t>
+        <w:br/>
+        <w:t xml:space="preserve">        +-- useUiVersion() === 'v2'  -&gt;  &lt;ProjectsLayoutV2 {...vm} /&gt;</w:t>
+      </w:r>
+    </w:p>
+    <w:p>
+      <w:r>
+        <w:t>An overlay would leave v1's DOM mounted (double-mounted maps, duplicated state, CSS fights, pointer-events/modal-freeze-class bugs). Siblings mean v1's tree simply isn't on the page in v2 mode, and “done” means deleting v1 cleanly once it's no longer needed.</w:t>
+      </w:r>
+    </w:p>
+    <w:p>
+      <w:pPr>
+        <w:pStyle w:val="Heading2"/>
+      </w:pPr>
+      <w:r/>
+      <w:r>
+        <w:t>11.4 Container / shell architecture</w:t>
+      </w:r>
+    </w:p>
+    <w:tbl>
+      <w:tblPr>
+        <w:tblStyle w:val="TableGrid"/>
+        <w:tblW w:type="auto" w:w="0"/>
+        <w:tblLook w:firstColumn="1" w:firstRow="1" w:lastColumn="0" w:lastRow="0" w:noHBand="0" w:noVBand="1" w:val="04A0"/>
+      </w:tblPr>
+      <w:tblGrid>
+        <w:gridCol w:w="2160"/>
+        <w:gridCol w:w="2160"/>
+        <w:gridCol w:w="2160"/>
+        <w:gridCol w:w="2160"/>
+      </w:tblGrid>
+      <w:tr>
+        <w:tc>
+          <w:tcPr>
+            <w:tcW w:type="dxa" w:w="2160"/>
+            <w:shd w:val="clear" w:color="auto" w:fill="EDF2F7"/>
+          </w:tcPr>
+          <w:p>
+            <w:r/>
+            <w:r>
+              <w:rPr>
+                <w:b/>
+                <w:sz w:val="18"/>
+              </w:rPr>
+              <w:t>Part</w:t>
+            </w:r>
+          </w:p>
+        </w:tc>
+        <w:tc>
+          <w:tcPr>
+            <w:tcW w:type="dxa" w:w="2160"/>
+            <w:shd w:val="clear" w:color="auto" w:fill="EDF2F7"/>
+          </w:tcPr>
+          <w:p>
+            <w:r/>
+            <w:r>
+              <w:rPr>
+                <w:b/>
+                <w:sz w:val="18"/>
+              </w:rPr>
+              <w:t>Owns</w:t>
+            </w:r>
+          </w:p>
+        </w:tc>
+        <w:tc>
+          <w:tcPr>
+            <w:tcW w:type="dxa" w:w="2160"/>
+            <w:shd w:val="clear" w:color="auto" w:fill="EDF2F7"/>
+          </w:tcPr>
+          <w:p>
+            <w:r/>
+            <w:r>
+              <w:rPr>
+                <w:b/>
+                <w:sz w:val="18"/>
+              </w:rPr>
+              <w:t>Who edits it</w:t>
+            </w:r>
+          </w:p>
+        </w:tc>
+        <w:tc>
+          <w:tcPr>
+            <w:tcW w:type="dxa" w:w="2160"/>
+            <w:shd w:val="clear" w:color="auto" w:fill="EDF2F7"/>
+          </w:tcPr>
+          <w:p>
+            <w:r/>
+            <w:r>
+              <w:rPr>
+                <w:b/>
+                <w:sz w:val="18"/>
+              </w:rPr>
+              <w:t>Conflict risk</w:t>
+            </w:r>
+          </w:p>
+        </w:tc>
+      </w:tr>
+      <w:tr>
+        <w:tc>
+          <w:tcPr>
+            <w:tcW w:type="dxa" w:w="2160"/>
+          </w:tcPr>
+          <w:p>
+            <w:r/>
+            <w:r>
+              <w:rPr>
+                <w:b w:val="0"/>
+                <w:sz w:val="18"/>
+              </w:rPr>
+              <w:t>Container (existing page file)</w:t>
+            </w:r>
+          </w:p>
+        </w:tc>
+        <w:tc>
+          <w:tcPr>
+            <w:tcW w:type="dxa" w:w="2160"/>
+          </w:tcPr>
+          <w:p>
+            <w:r/>
+            <w:r>
+              <w:rPr>
+                <w:b w:val="0"/>
+                <w:sz w:val="18"/>
+              </w:rPr>
+              <w:t>data fetch, hooks, sessionStorage/cache contracts, all callbacks, building the view-model</w:t>
+            </w:r>
+          </w:p>
+        </w:tc>
+        <w:tc>
+          <w:tcPr>
+            <w:tcW w:type="dxa" w:w="2160"/>
+          </w:tcPr>
+          <w:p>
+            <w:r/>
+            <w:r>
+              <w:rPr>
+                <w:b w:val="0"/>
+                <w:sz w:val="18"/>
+              </w:rPr>
+              <w:t>the team (bugfixes) + one-time hoist</w:t>
+            </w:r>
+          </w:p>
+        </w:tc>
+        <w:tc>
+          <w:tcPr>
+            <w:tcW w:type="dxa" w:w="2160"/>
+          </w:tcPr>
+          <w:p>
+            <w:r/>
+            <w:r>
+              <w:rPr>
+                <w:b w:val="0"/>
+                <w:sz w:val="18"/>
+              </w:rPr>
+              <w:t>shared file — touch minimally</w:t>
+            </w:r>
+          </w:p>
+        </w:tc>
+      </w:tr>
+      <w:tr>
+        <w:tc>
+          <w:tcPr>
+            <w:tcW w:type="dxa" w:w="2160"/>
+          </w:tcPr>
+          <w:p>
+            <w:r/>
+            <w:r>
+              <w:rPr>
+                <w:b w:val="0"/>
+                <w:sz w:val="18"/>
+              </w:rPr>
+              <w:t>Layout shell (new file)</w:t>
+            </w:r>
+          </w:p>
+        </w:tc>
+        <w:tc>
+          <w:tcPr>
+            <w:tcW w:type="dxa" w:w="2160"/>
+          </w:tcPr>
+          <w:p>
+            <w:r/>
+            <w:r>
+              <w:rPr>
+                <w:b w:val="0"/>
+                <w:sz w:val="18"/>
+              </w:rPr>
+              <w:t>pure presentation — arranges existing components, wires them to view-model props</w:t>
+            </w:r>
+          </w:p>
+        </w:tc>
+        <w:tc>
+          <w:tcPr>
+            <w:tcW w:type="dxa" w:w="2160"/>
+          </w:tcPr>
+          <w:p>
+            <w:r/>
+            <w:r>
+              <w:rPr>
+                <w:b w:val="0"/>
+                <w:sz w:val="18"/>
+              </w:rPr>
+              <w:t>shell author only</w:t>
+            </w:r>
+          </w:p>
+        </w:tc>
+        <w:tc>
+          <w:tcPr>
+            <w:tcW w:type="dxa" w:w="2160"/>
+          </w:tcPr>
+          <w:p>
+            <w:r/>
+            <w:r>
+              <w:rPr>
+                <w:b w:val="0"/>
+                <w:sz w:val="18"/>
+              </w:rPr>
+              <w:t>new file → ~zero conflict</w:t>
+            </w:r>
+          </w:p>
+        </w:tc>
+      </w:tr>
+    </w:tbl>
+    <w:p>
+      <w:r>
+        <w:rPr>
+          <w:b/>
+        </w:rPr>
+        <w:t>Rule 1 — the prop-contract is the seam.</w:t>
+      </w:r>
+      <w:r>
+        <w:t xml:space="preserve"> The container assembles one typed view-model object and passes it to whichever shell is active. v1 and v2 shells consume identical props.</w:t>
+      </w:r>
+    </w:p>
+    <w:p>
+      <w:r>
+        <w:rPr>
+          <w:b/>
+        </w:rPr>
+        <w:t>Rule 2 — new components get their data from the container, never their own fetch.</w:t>
+      </w:r>
+      <w:r>
+        <w:t xml:space="preserve"> If a new component needs backend data, the container fetches it (through the existing hooks / </w:t>
+      </w:r>
+      <w:r>
+        <w:rPr>
+          <w:rFonts w:ascii="Courier New" w:hAnsi="Courier New"/>
+          <w:color w:val="C53030"/>
+          <w:sz w:val="18"/>
+        </w:rPr>
+        <w:t>projectDataCache</w:t>
+      </w:r>
+      <w:r>
+        <w:t>) and passes it down as part of the view-model.</w:t>
+      </w:r>
+    </w:p>
+    <w:p>
+      <w:r>
+        <w:rPr>
+          <w:b/>
+        </w:rPr>
+        <w:t>Rule 3 — swap = flip default, then delete.</w:t>
+      </w:r>
+      <w:r>
+        <w:t xml:space="preserve"> Once v2 is the settled default and stable, remove each </w:t>
+      </w:r>
+      <w:r>
+        <w:rPr>
+          <w:rFonts w:ascii="Courier New" w:hAnsi="Courier New"/>
+          <w:color w:val="C53030"/>
+          <w:sz w:val="18"/>
+        </w:rPr>
+        <w:t>*LayoutV1.tsx</w:t>
+      </w:r>
+      <w:r>
+        <w:t xml:space="preserve">, drop the </w:t>
+      </w:r>
+      <w:r>
+        <w:rPr>
+          <w:rFonts w:ascii="Courier New" w:hAnsi="Courier New"/>
+          <w:color w:val="C53030"/>
+          <w:sz w:val="18"/>
+        </w:rPr>
+        <w:t>ui === "v2" ? ... : ...</w:t>
+      </w:r>
+      <w:r>
+        <w:t xml:space="preserve"> branch in each container, and remove the gated v1 branches in </w:t>
+      </w:r>
+      <w:r>
+        <w:rPr>
+          <w:rFonts w:ascii="Courier New" w:hAnsi="Courier New"/>
+          <w:color w:val="C53030"/>
+          <w:sz w:val="18"/>
+        </w:rPr>
+        <w:t>provider.tsx</w:t>
+      </w:r>
+      <w:r>
+        <w:t xml:space="preserve"> / </w:t>
+      </w:r>
+      <w:r>
+        <w:rPr>
+          <w:rFonts w:ascii="Courier New" w:hAnsi="Courier New"/>
+          <w:color w:val="C53030"/>
+          <w:sz w:val="18"/>
+        </w:rPr>
+        <w:t>AppLayout.tsx</w:t>
+      </w:r>
+      <w:r>
+        <w:t xml:space="preserve"> / </w:t>
+      </w:r>
+      <w:r>
+        <w:rPr>
+          <w:rFonts w:ascii="Courier New" w:hAnsi="Courier New"/>
+          <w:color w:val="C53030"/>
+          <w:sz w:val="18"/>
+        </w:rPr>
+        <w:t>Sidebar.tsx</w:t>
+      </w:r>
+      <w:r>
+        <w:t>.</w:t>
+      </w:r>
+    </w:p>
+    <w:p>
+      <w:pPr>
+        <w:pStyle w:val="Heading2"/>
+      </w:pPr>
+      <w:r/>
+      <w:r>
+        <w:t>11.5 Design source of truth</w:t>
+      </w:r>
+    </w:p>
+    <w:tbl>
+      <w:tblPr>
+        <w:tblStyle w:val="TableGrid"/>
+        <w:tblW w:type="auto" w:w="0"/>
+        <w:tblLook w:firstColumn="1" w:firstRow="1" w:lastColumn="0" w:lastRow="0" w:noHBand="0" w:noVBand="1" w:val="04A0"/>
+      </w:tblPr>
+      <w:tblGrid>
+        <w:gridCol w:w="2880"/>
+        <w:gridCol w:w="2880"/>
+        <w:gridCol w:w="2880"/>
+      </w:tblGrid>
+      <w:tr>
+        <w:tc>
+          <w:tcPr>
+            <w:tcW w:type="dxa" w:w="2880"/>
+            <w:shd w:val="clear" w:color="auto" w:fill="EDF2F7"/>
+          </w:tcPr>
+          <w:p>
+            <w:r/>
+            <w:r>
+              <w:rPr>
+                <w:b/>
+                <w:sz w:val="18"/>
+              </w:rPr>
+              <w:t>File / folder</w:t>
+            </w:r>
+          </w:p>
+        </w:tc>
+        <w:tc>
+          <w:tcPr>
+            <w:tcW w:type="dxa" w:w="2880"/>
+            <w:shd w:val="clear" w:color="auto" w:fill="EDF2F7"/>
+          </w:tcPr>
+          <w:p>
+            <w:r/>
+            <w:r>
+              <w:rPr>
+                <w:b/>
+                <w:sz w:val="18"/>
+              </w:rPr>
+              <w:t>Role</w:t>
+            </w:r>
+          </w:p>
+        </w:tc>
+        <w:tc>
+          <w:tcPr>
+            <w:tcW w:type="dxa" w:w="2880"/>
+            <w:shd w:val="clear" w:color="auto" w:fill="EDF2F7"/>
+          </w:tcPr>
+          <w:p>
+            <w:r/>
+            <w:r>
+              <w:rPr>
+                <w:b/>
+                <w:sz w:val="18"/>
+              </w:rPr>
+              <w:t>How to use it</w:t>
+            </w:r>
+          </w:p>
+        </w:tc>
+      </w:tr>
+      <w:tr>
+        <w:tc>
+          <w:tcPr>
+            <w:tcW w:type="dxa" w:w="2880"/>
+          </w:tcPr>
+          <w:p>
+            <w:r/>
+            <w:r>
+              <w:rPr>
+                <w:b w:val="0"/>
+                <w:sz w:val="18"/>
+              </w:rPr>
+              <w:t>DESIGN_GUIDE.md</w:t>
+            </w:r>
+          </w:p>
+        </w:tc>
+        <w:tc>
+          <w:tcPr>
+            <w:tcW w:type="dxa" w:w="2880"/>
+          </w:tcPr>
+          <w:p>
+            <w:r/>
+            <w:r>
+              <w:rPr>
+                <w:b w:val="0"/>
+                <w:sz w:val="18"/>
+              </w:rPr>
+              <w:t>Normative design system — the single source of truth for tokens, type, spacing, components</w:t>
+            </w:r>
+          </w:p>
+        </w:tc>
+        <w:tc>
+          <w:tcPr>
+            <w:tcW w:type="dxa" w:w="2880"/>
+          </w:tcPr>
+          <w:p>
+            <w:r/>
+            <w:r>
+              <w:rPr>
+                <w:b w:val="0"/>
+                <w:sz w:val="18"/>
+              </w:rPr>
+              <w:t>Obey it. “If a screen disagrees with this doc, the screen is wrong.”</w:t>
+            </w:r>
+          </w:p>
+        </w:tc>
+      </w:tr>
+      <w:tr>
+        <w:tc>
+          <w:tcPr>
+            <w:tcW w:type="dxa" w:w="2880"/>
+          </w:tcPr>
+          <w:p>
+            <w:r/>
+            <w:r>
+              <w:rPr>
+                <w:b w:val="0"/>
+                <w:sz w:val="18"/>
+              </w:rPr>
+              <w:t>*.dc.html comps</w:t>
+            </w:r>
+          </w:p>
+        </w:tc>
+        <w:tc>
+          <w:tcPr>
+            <w:tcW w:type="dxa" w:w="2880"/>
+          </w:tcPr>
+          <w:p>
+            <w:r/>
+            <w:r>
+              <w:rPr>
+                <w:b w:val="0"/>
+                <w:sz w:val="18"/>
+              </w:rPr>
+              <w:t>Visual comps of each screen's new arrangement</w:t>
+            </w:r>
+          </w:p>
+        </w:tc>
+        <w:tc>
+          <w:tcPr>
+            <w:tcW w:type="dxa" w:w="2880"/>
+          </w:tcPr>
+          <w:p>
+            <w:r/>
+            <w:r>
+              <w:rPr>
+                <w:b w:val="0"/>
+                <w:sz w:val="18"/>
+              </w:rPr>
+              <w:t>Translate to Chakra/React — do not port the mockup runtime</w:t>
+            </w:r>
+          </w:p>
+        </w:tc>
+      </w:tr>
+      <w:tr>
+        <w:tc>
+          <w:tcPr>
+            <w:tcW w:type="dxa" w:w="2880"/>
+          </w:tcPr>
+          <w:p>
+            <w:r/>
+            <w:r>
+              <w:rPr>
+                <w:b w:val="0"/>
+                <w:sz w:val="18"/>
+              </w:rPr>
+              <w:t>screenshots/</w:t>
+            </w:r>
+          </w:p>
+        </w:tc>
+        <w:tc>
+          <w:tcPr>
+            <w:tcW w:type="dxa" w:w="2880"/>
+          </w:tcPr>
+          <w:p>
+            <w:r/>
+            <w:r>
+              <w:rPr>
+                <w:b w:val="0"/>
+                <w:sz w:val="18"/>
+              </w:rPr>
+              <w:t>Rendered references of the comps</w:t>
+            </w:r>
+          </w:p>
+        </w:tc>
+        <w:tc>
+          <w:tcPr>
+            <w:tcW w:type="dxa" w:w="2880"/>
+          </w:tcPr>
+          <w:p>
+            <w:r/>
+            <w:r>
+              <w:rPr>
+                <w:b w:val="0"/>
+                <w:sz w:val="18"/>
+              </w:rPr>
+              <w:t>Sanity-check the built shell against intent</w:t>
+            </w:r>
+          </w:p>
+        </w:tc>
+      </w:tr>
+      <w:tr>
+        <w:tc>
+          <w:tcPr>
+            <w:tcW w:type="dxa" w:w="2880"/>
+          </w:tcPr>
+          <w:p>
+            <w:r/>
+            <w:r>
+              <w:rPr>
+                <w:b w:val="0"/>
+                <w:sz w:val="18"/>
+              </w:rPr>
+              <w:t>assets/psat-logo.png</w:t>
+            </w:r>
+          </w:p>
+        </w:tc>
+        <w:tc>
+          <w:tcPr>
+            <w:tcW w:type="dxa" w:w="2880"/>
+          </w:tcPr>
+          <w:p>
+            <w:r/>
+            <w:r>
+              <w:rPr>
+                <w:b w:val="0"/>
+                <w:sz w:val="18"/>
+              </w:rPr>
+              <w:t>Brand asset</w:t>
+            </w:r>
+          </w:p>
+        </w:tc>
+        <w:tc>
+          <w:tcPr>
+            <w:tcW w:type="dxa" w:w="2880"/>
+          </w:tcPr>
+          <w:p>
+            <w:r/>
+            <w:r>
+              <w:rPr>
+                <w:b w:val="0"/>
+                <w:sz w:val="18"/>
+              </w:rPr>
+              <w:t>Use where the sidebar/landing needs the logo</w:t>
+            </w:r>
+          </w:p>
+        </w:tc>
+      </w:tr>
+    </w:tbl>
+    <w:p>
+      <w:r>
+        <w:t>Comps are fixed-size mockups (e.g. 1920×900); React shells must be fluid/responsive, never pixel-frozen.</w:t>
+      </w:r>
+    </w:p>
+    <w:p>
+      <w:pPr>
+        <w:pStyle w:val="Heading2"/>
+      </w:pPr>
+      <w:r/>
+      <w:r>
+        <w:t>11.6 v2 design tokens</w:t>
+      </w:r>
+    </w:p>
+    <w:p>
+      <w:pPr>
+        <w:pStyle w:val="ListBullet"/>
+      </w:pPr>
+      <w:r>
+        <w:rPr>
+          <w:b/>
+        </w:rPr>
+        <w:t>Font:</w:t>
+      </w:r>
+      <w:r>
+        <w:t xml:space="preserve"> Inter (400 / 500 / 700 only — no 600).</w:t>
+      </w:r>
+    </w:p>
+    <w:p>
+      <w:pPr>
+        <w:pStyle w:val="ListBullet"/>
+      </w:pPr>
+      <w:r>
+        <w:rPr>
+          <w:b/>
+        </w:rPr>
+        <w:t>Surfaces / text:</w:t>
+      </w:r>
+      <w:r>
+        <w:t xml:space="preserve"> canvas </w:t>
+      </w:r>
+      <w:r>
+        <w:rPr>
+          <w:rFonts w:ascii="Courier New" w:hAnsi="Courier New"/>
+          <w:color w:val="C53030"/>
+          <w:sz w:val="18"/>
+        </w:rPr>
+        <w:t>#F7FAFC</w:t>
+      </w:r>
+      <w:r>
+        <w:t xml:space="preserve">; cards </w:t>
+      </w:r>
+      <w:r>
+        <w:rPr>
+          <w:rFonts w:ascii="Courier New" w:hAnsi="Courier New"/>
+          <w:color w:val="C53030"/>
+          <w:sz w:val="18"/>
+        </w:rPr>
+        <w:t>#fff</w:t>
+      </w:r>
+      <w:r>
+        <w:t xml:space="preserve"> + </w:t>
+      </w:r>
+      <w:r>
+        <w:rPr>
+          <w:rFonts w:ascii="Courier New" w:hAnsi="Courier New"/>
+          <w:color w:val="C53030"/>
+          <w:sz w:val="18"/>
+        </w:rPr>
+        <w:t>1px #E2E8F0</w:t>
+      </w:r>
+      <w:r>
+        <w:t xml:space="preserve"> border + </w:t>
+      </w:r>
+      <w:r>
+        <w:rPr>
+          <w:rFonts w:ascii="Courier New" w:hAnsi="Courier New"/>
+          <w:color w:val="C53030"/>
+          <w:sz w:val="18"/>
+        </w:rPr>
+        <w:t>6px</w:t>
+      </w:r>
+      <w:r>
+        <w:t xml:space="preserve"> radius; darkest text </w:t>
+      </w:r>
+      <w:r>
+        <w:rPr>
+          <w:rFonts w:ascii="Courier New" w:hAnsi="Courier New"/>
+          <w:color w:val="C53030"/>
+          <w:sz w:val="18"/>
+        </w:rPr>
+        <w:t>#2D3748</w:t>
+      </w:r>
+      <w:r>
+        <w:t xml:space="preserve"> (never </w:t>
+      </w:r>
+      <w:r>
+        <w:rPr>
+          <w:rFonts w:ascii="Courier New" w:hAnsi="Courier New"/>
+          <w:color w:val="C53030"/>
+          <w:sz w:val="18"/>
+        </w:rPr>
+        <w:t>#000</w:t>
+      </w:r>
+      <w:r>
+        <w:t>).</w:t>
+      </w:r>
+    </w:p>
+    <w:p>
+      <w:pPr>
+        <w:pStyle w:val="ListBullet"/>
+      </w:pPr>
+      <w:r>
+        <w:rPr>
+          <w:b/>
+        </w:rPr>
+        <w:t>Accent = scope, not decoration:</w:t>
+      </w:r>
+      <w:r>
+        <w:t xml:space="preserve"> blue </w:t>
+      </w:r>
+      <w:r>
+        <w:rPr>
+          <w:rFonts w:ascii="Courier New" w:hAnsi="Courier New"/>
+          <w:color w:val="C53030"/>
+          <w:sz w:val="18"/>
+        </w:rPr>
+        <w:t>#3182CE</w:t>
+      </w:r>
+      <w:r>
+        <w:t xml:space="preserve"> = local (acts on one segment/selection); teal </w:t>
+      </w:r>
+      <w:r>
+        <w:rPr>
+          <w:rFonts w:ascii="Courier New" w:hAnsi="Courier New"/>
+          <w:color w:val="C53030"/>
+          <w:sz w:val="18"/>
+        </w:rPr>
+        <w:t>#319795</w:t>
+      </w:r>
+      <w:r>
+        <w:t xml:space="preserve"> = global (acts on the project / all).</w:t>
+      </w:r>
+    </w:p>
+    <w:p>
+      <w:pPr>
+        <w:pStyle w:val="ListBullet"/>
+      </w:pPr>
+      <w:r>
+        <w:rPr>
+          <w:b/>
+        </w:rPr>
+        <w:t>RSB risk hues are unchanged:</w:t>
+      </w:r>
+      <w:r>
+        <w:t xml:space="preserve"> green </w:t>
+      </w:r>
+      <w:r>
+        <w:rPr>
+          <w:rFonts w:ascii="Courier New" w:hAnsi="Courier New"/>
+          <w:color w:val="C53030"/>
+          <w:sz w:val="18"/>
+        </w:rPr>
+        <w:t>#87c424</w:t>
+      </w:r>
+      <w:r>
+        <w:t xml:space="preserve"> / yellow </w:t>
+      </w:r>
+      <w:r>
+        <w:rPr>
+          <w:rFonts w:ascii="Courier New" w:hAnsi="Courier New"/>
+          <w:color w:val="C53030"/>
+          <w:sz w:val="18"/>
+        </w:rPr>
+        <w:t>#ffcc1a</w:t>
+      </w:r>
+      <w:r>
+        <w:t xml:space="preserve"> / orange-red </w:t>
+      </w:r>
+      <w:r>
+        <w:rPr>
+          <w:rFonts w:ascii="Courier New" w:hAnsi="Courier New"/>
+          <w:color w:val="C53030"/>
+          <w:sz w:val="18"/>
+        </w:rPr>
+        <w:t>#ff5b1a</w:t>
+      </w:r>
+      <w:r>
+        <w:t xml:space="preserve"> / purple </w:t>
+      </w:r>
+      <w:r>
+        <w:rPr>
+          <w:rFonts w:ascii="Courier New" w:hAnsi="Courier New"/>
+          <w:color w:val="C53030"/>
+          <w:sz w:val="18"/>
+        </w:rPr>
+        <w:t>#cd1aff</w:t>
+      </w:r>
+      <w:r>
+        <w:t xml:space="preserve"> — these already match </w:t>
+      </w:r>
+      <w:r>
+        <w:rPr>
+          <w:rFonts w:ascii="Courier New" w:hAnsi="Courier New"/>
+          <w:color w:val="C53030"/>
+          <w:sz w:val="18"/>
+        </w:rPr>
+        <w:t>colorConstants.ts</w:t>
+      </w:r>
+      <w:r>
+        <w:t>. Reuse that file; do not redefine them in the theme.</w:t>
+      </w:r>
+    </w:p>
+    <w:p>
+      <w:r>
+        <w:t xml:space="preserve">Full normative detail (spacing, buttons, tabs, switches, chips, cards) lives in </w:t>
+      </w:r>
+      <w:r>
+        <w:rPr>
+          <w:rFonts w:ascii="Courier New" w:hAnsi="Courier New"/>
+          <w:color w:val="C53030"/>
+          <w:sz w:val="18"/>
+        </w:rPr>
+        <w:t>DESIGN_GUIDE.md</w:t>
+      </w:r>
+      <w:r>
+        <w:t xml:space="preserve"> — treat it as the spec, not something to re-derive here.</w:t>
+      </w:r>
+    </w:p>
+    <w:p>
+      <w:pPr>
+        <w:pStyle w:val="Heading2"/>
+      </w:pPr>
+      <w:r/>
+      <w:r>
+        <w:t>11.7 Do / Don't quick reference</w:t>
+      </w:r>
+    </w:p>
+    <w:p>
+      <w:r>
+        <w:rPr>
+          <w:b/>
+        </w:rPr>
+        <w:t>Do</w:t>
+      </w:r>
+    </w:p>
+    <w:p>
+      <w:pPr>
+        <w:pStyle w:val="ListBullet"/>
+      </w:pPr>
+      <w:r>
+        <w:t>Keep the container as the single owner of server state, sessionStorage keys, and cache.</w:t>
+      </w:r>
+    </w:p>
+    <w:p>
+      <w:pPr>
+        <w:pStyle w:val="ListBullet"/>
+      </w:pPr>
+      <w:r>
+        <w:t>Pass everything to shells via the typed view-model.</w:t>
+      </w:r>
+    </w:p>
+    <w:p>
+      <w:pPr>
+        <w:pStyle w:val="ListBullet"/>
+      </w:pPr>
+      <w:r>
+        <w:t xml:space="preserve">Build v2 shells as new files; debug live with </w:t>
+      </w:r>
+      <w:r>
+        <w:rPr>
+          <w:rFonts w:ascii="Courier New" w:hAnsi="Courier New"/>
+          <w:color w:val="C53030"/>
+          <w:sz w:val="18"/>
+        </w:rPr>
+        <w:t>?ui=v2</w:t>
+      </w:r>
+      <w:r>
+        <w:t>.</w:t>
+      </w:r>
+    </w:p>
+    <w:p>
+      <w:pPr>
+        <w:pStyle w:val="ListBullet"/>
+      </w:pPr>
+      <w:r>
+        <w:t>Gate global seams once, at the root, behind the same flag.</w:t>
+      </w:r>
+    </w:p>
+    <w:p>
+      <w:pPr>
+        <w:pStyle w:val="ListBullet"/>
+      </w:pPr>
+      <w:r>
+        <w:t xml:space="preserve">Treat </w:t>
+      </w:r>
+      <w:r>
+        <w:rPr>
+          <w:rFonts w:ascii="Courier New" w:hAnsi="Courier New"/>
+          <w:color w:val="C53030"/>
+          <w:sz w:val="18"/>
+        </w:rPr>
+        <w:t>DESIGN_GUIDE.md</w:t>
+      </w:r>
+      <w:r>
+        <w:t xml:space="preserve"> as the spec; reuse </w:t>
+      </w:r>
+      <w:r>
+        <w:rPr>
+          <w:rFonts w:ascii="Courier New" w:hAnsi="Courier New"/>
+          <w:color w:val="C53030"/>
+          <w:sz w:val="18"/>
+        </w:rPr>
+        <w:t>colorConstants.ts</w:t>
+      </w:r>
+      <w:r>
+        <w:t xml:space="preserve"> for RSB hues.</w:t>
+      </w:r>
+    </w:p>
+    <w:p>
+      <w:r>
+        <w:rPr>
+          <w:b/>
+        </w:rPr>
+        <w:t>Don't</w:t>
+      </w:r>
+    </w:p>
+    <w:p>
+      <w:pPr>
+        <w:pStyle w:val="ListBullet"/>
+      </w:pPr>
+      <w:r>
+        <w:t xml:space="preserve">Don't port the </w:t>
+      </w:r>
+      <w:r>
+        <w:rPr>
+          <w:rFonts w:ascii="Courier New" w:hAnsi="Courier New"/>
+          <w:color w:val="C53030"/>
+          <w:sz w:val="18"/>
+        </w:rPr>
+        <w:t>.dc.html</w:t>
+      </w:r>
+      <w:r>
+        <w:t xml:space="preserve"> mockup runtime — translate the visual intent to Chakra/React.</w:t>
+      </w:r>
+    </w:p>
+    <w:p>
+      <w:pPr>
+        <w:pStyle w:val="ListBullet"/>
+      </w:pPr>
+      <w:r>
+        <w:t>Don't reproduce the comps' fixed sizing — shells must be fluid.</w:t>
+      </w:r>
+    </w:p>
+    <w:p>
+      <w:pPr>
+        <w:pStyle w:val="ListBullet"/>
+      </w:pPr>
+      <w:r>
+        <w:t xml:space="preserve">Don't create </w:t>
+      </w:r>
+      <w:r>
+        <w:rPr>
+          <w:rFonts w:ascii="Courier New" w:hAnsi="Courier New"/>
+          <w:color w:val="C53030"/>
+          <w:sz w:val="18"/>
+        </w:rPr>
+        <w:t>/new/*</w:t>
+      </w:r>
+      <w:r>
+        <w:t xml:space="preserve"> routes or duplicate the container.</w:t>
+      </w:r>
+    </w:p>
+    <w:p>
+      <w:pPr>
+        <w:pStyle w:val="ListBullet"/>
+      </w:pPr>
+      <w:r>
+        <w:t>Don't let a shell fetch data, own server state, or touch sessionStorage directly.</w:t>
+      </w:r>
+    </w:p>
+    <w:p>
+      <w:pPr>
+        <w:pStyle w:val="ListBullet"/>
+      </w:pPr>
+      <w:r>
+        <w:t xml:space="preserve">Don't delete dark mode, </w:t>
+      </w:r>
+      <w:r>
+        <w:rPr>
+          <w:rFonts w:ascii="Courier New" w:hAnsi="Courier New"/>
+          <w:color w:val="C53030"/>
+          <w:sz w:val="18"/>
+        </w:rPr>
+        <w:t>_dark</w:t>
+      </w:r>
+      <w:r>
+        <w:t xml:space="preserve"> props, or the old sidebar while both UIs are live.</w:t>
+      </w:r>
+    </w:p>
+    <w:p>
+      <w:pPr>
+        <w:pStyle w:val="ListBullet"/>
+      </w:pPr>
+      <w:r>
+        <w:t>Don't try to hot-swap the theme without a reload.</w:t>
+      </w:r>
+    </w:p>
+    <w:p>
+      <w:pPr>
+        <w:pStyle w:val="ListBullet"/>
+      </w:pPr>
+      <w:r>
+        <w:t xml:space="preserve">Don't change route params or sessionStorage key names — deep links and cross-page contracts depend on them (see the root </w:t>
+      </w:r>
+      <w:r>
+        <w:rPr>
+          <w:rFonts w:ascii="Courier New" w:hAnsi="Courier New"/>
+          <w:color w:val="C53030"/>
+          <w:sz w:val="18"/>
+        </w:rPr>
+        <w:t>CLAUDE.md</w:t>
+      </w:r>
+      <w:r>
+        <w:t>).</w:t>
+      </w:r>
+    </w:p>
+    <w:p>
+      <w:r>
+        <w:br w:type="page"/>
+      </w:r>
+    </w:p>
+    <w:p>
+      <w:pPr>
+        <w:pStyle w:val="Heading1"/>
+      </w:pPr>
+      <w:r/>
+      <w:r>
+        <w:t>12. In-Image Path Measurement (Single-View Metrology)</w:t>
+      </w:r>
+    </w:p>
+    <w:p>
+      <w:r>
+        <w:t>A frontend-only tool, hung off the Coding page's image panel, that recovers a pixel → ground-metres mapping for a street-level survey frame and lets a planner measure real-world clear widths directly on the photo. This section is the developer-facing technical reference. For the workflow from a planner's point of view, see User Guide §7: In-Image Path Measurement.</w:t>
+      </w:r>
+    </w:p>
+    <w:p>
+      <w:r>
+        <w:rPr>
+          <w:b/>
+        </w:rPr>
+        <w:t>Living design log:</w:t>
+      </w:r>
+      <w:r>
+        <w:t xml:space="preserve"> the full chronological decision history — including bugs found and fixed, rejected approaches, and calibration provenance — lives in </w:t>
+      </w:r>
+      <w:r>
+        <w:rPr>
+          <w:rFonts w:ascii="Courier New" w:hAnsi="Courier New"/>
+          <w:color w:val="C53030"/>
+          <w:sz w:val="18"/>
+        </w:rPr>
+        <w:t>docs/in-image-metrology.md</w:t>
+      </w:r>
+      <w:r>
+        <w:t xml:space="preserve"> (repo root </w:t>
+      </w:r>
+      <w:r>
+        <w:rPr>
+          <w:rFonts w:ascii="Courier New" w:hAnsi="Courier New"/>
+          <w:color w:val="C53030"/>
+          <w:sz w:val="18"/>
+        </w:rPr>
+        <w:t>docs/</w:t>
+      </w:r>
+      <w:r>
+        <w:t>). Treat that file as the canonical, most up-to-date reference and this section as the condensed summary.</w:t>
+      </w:r>
+    </w:p>
+    <w:p>
+      <w:pPr>
+        <w:pBdr>
+          <w:bottom w:val="single" w:sz="6" w:space="1" w:color="CCCCCC"/>
+        </w:pBdr>
+        <w:spacing w:after="0"/>
+      </w:pPr>
+    </w:p>
+    <w:p>
+      <w:pPr>
+        <w:pStyle w:val="Heading2"/>
+      </w:pPr>
+      <w:r/>
+      <w:r>
+        <w:t>Table of Contents</w:t>
+      </w:r>
+    </w:p>
+    <w:p>
+      <w:pPr>
+        <w:pBdr>
+          <w:bottom w:val="single" w:sz="6" w:space="1" w:color="CCCCCC"/>
+        </w:pBdr>
+        <w:spacing w:after="0"/>
+      </w:pPr>
+    </w:p>
+    <w:p>
+      <w:pPr>
+        <w:pStyle w:val="Heading2"/>
+      </w:pPr>
+      <w:r/>
+      <w:r>
+        <w:t>12.1 What it is</w:t>
+      </w:r>
+    </w:p>
+    <w:p>
+      <w:r>
+        <w:t>A tool that lets a planner measure real-world distances directly on a street-level survey frame — how many metres of clear width sit either side of a path before hitting a tree, drain, railing, or kerb. The purpose is judging whether a path can be widened or have a cycling lane added, against real physical obstructions that the top-down GIS width layers do not capture (and are known to get wrong).</w:t>
+      </w:r>
+    </w:p>
+    <w:p>
+      <w:r>
+        <w:t>It works by recovering a pixel → ground-metres mapping for a frame, then painting a metric grid / ruler on the photo. The reliable path derives that mapping exactly from a drain grating of known size that the user clicks; manual dials cover frames without a grating.</w:t>
+      </w:r>
+    </w:p>
+    <w:p>
+      <w:r>
+        <w:rPr>
+          <w:b/>
+        </w:rPr>
+        <w:t>Scope:</w:t>
+      </w:r>
+      <w:r>
+        <w:t xml:space="preserve"> widths on the ground plane only. No heights, no overhead clearance (deliberately deferred). Live on-screen read-off only — measurements are not saved to the segment in this version (persistence was designed-for but deferred).</w:t>
+      </w:r>
+    </w:p>
+    <w:p>
+      <w:pPr>
+        <w:pStyle w:val="Heading2"/>
+      </w:pPr>
+      <w:r/>
+      <w:r>
+        <w:t>12.2 Status</w:t>
+      </w:r>
+    </w:p>
+    <w:tbl>
+      <w:tblPr>
+        <w:tblStyle w:val="TableGrid"/>
+        <w:tblW w:type="auto" w:w="0"/>
+        <w:tblLook w:firstColumn="1" w:firstRow="1" w:lastColumn="0" w:lastRow="0" w:noHBand="0" w:noVBand="1" w:val="04A0"/>
+      </w:tblPr>
+      <w:tblGrid>
+        <w:gridCol w:w="4320"/>
+        <w:gridCol w:w="4320"/>
+      </w:tblGrid>
+      <w:tr>
+        <w:tc>
+          <w:tcPr>
+            <w:tcW w:type="dxa" w:w="4320"/>
+            <w:shd w:val="clear" w:color="auto" w:fill="EDF2F7"/>
+          </w:tcPr>
+          <w:p>
+            <w:r/>
+            <w:r>
+              <w:rPr>
+                <w:b/>
+                <w:sz w:val="18"/>
+              </w:rPr>
+              <w:t>Area</w:t>
+            </w:r>
+          </w:p>
+        </w:tc>
+        <w:tc>
+          <w:tcPr>
+            <w:tcW w:type="dxa" w:w="4320"/>
+            <w:shd w:val="clear" w:color="auto" w:fill="EDF2F7"/>
+          </w:tcPr>
+          <w:p>
+            <w:r/>
+            <w:r>
+              <w:rPr>
+                <w:b/>
+                <w:sz w:val="18"/>
+              </w:rPr>
+              <w:t>State</w:t>
+            </w:r>
+          </w:p>
+        </w:tc>
+      </w:tr>
+      <w:tr>
+        <w:tc>
+          <w:tcPr>
+            <w:tcW w:type="dxa" w:w="4320"/>
+          </w:tcPr>
+          <w:p>
+            <w:r/>
+            <w:r>
+              <w:rPr>
+                <w:b w:val="0"/>
+                <w:sz w:val="18"/>
+              </w:rPr>
+              <w:t>Geometry / math</w:t>
+            </w:r>
+          </w:p>
+        </w:tc>
+        <w:tc>
+          <w:tcPr>
+            <w:tcW w:type="dxa" w:w="4320"/>
+          </w:tcPr>
+          <w:p>
+            <w:r/>
+            <w:r>
+              <w:rPr>
+                <w:b w:val="0"/>
+                <w:sz w:val="18"/>
+              </w:rPr>
+              <w:t>Built and verified exact (see §12.4)</w:t>
+            </w:r>
+          </w:p>
+        </w:tc>
+      </w:tr>
+      <w:tr>
+        <w:tc>
+          <w:tcPr>
+            <w:tcW w:type="dxa" w:w="4320"/>
+          </w:tcPr>
+          <w:p>
+            <w:r/>
+            <w:r>
+              <w:rPr>
+                <w:b w:val="0"/>
+                <w:sz w:val="18"/>
+              </w:rPr>
+              <w:t>Calibration (rig constants)</w:t>
+            </w:r>
+          </w:p>
+        </w:tc>
+        <w:tc>
+          <w:tcPr>
+            <w:tcW w:type="dxa" w:w="4320"/>
+          </w:tcPr>
+          <w:p>
+            <w:r/>
+            <w:r>
+              <w:rPr>
+                <w:b w:val="0"/>
+                <w:sz w:val="18"/>
+              </w:rPr>
+              <w:t>Best-effort, not final — derived from scene, not a known mount (§12.5)</w:t>
+            </w:r>
+          </w:p>
+        </w:tc>
+      </w:tr>
+      <w:tr>
+        <w:tc>
+          <w:tcPr>
+            <w:tcW w:type="dxa" w:w="4320"/>
+          </w:tcPr>
+          <w:p>
+            <w:r/>
+            <w:r>
+              <w:rPr>
+                <w:b w:val="0"/>
+                <w:sz w:val="18"/>
+              </w:rPr>
+              <w:t>Coding-page integration</w:t>
+            </w:r>
+          </w:p>
+        </w:tc>
+        <w:tc>
+          <w:tcPr>
+            <w:tcW w:type="dxa" w:w="4320"/>
+          </w:tcPr>
+          <w:p>
+            <w:r/>
+            <w:r>
+              <w:rPr>
+                <w:b w:val="0"/>
+                <w:sz w:val="18"/>
+              </w:rPr>
+              <w:t>Built, types clean, builds &amp; serves</w:t>
+            </w:r>
+          </w:p>
+        </w:tc>
+      </w:tr>
+      <w:tr>
+        <w:tc>
+          <w:tcPr>
+            <w:tcW w:type="dxa" w:w="4320"/>
+          </w:tcPr>
+          <w:p>
+            <w:r/>
+            <w:r>
+              <w:rPr>
+                <w:b w:val="0"/>
+                <w:sz w:val="18"/>
+              </w:rPr>
+              <w:t>Live click-through test</w:t>
+            </w:r>
+          </w:p>
+        </w:tc>
+        <w:tc>
+          <w:tcPr>
+            <w:tcW w:type="dxa" w:w="4320"/>
+          </w:tcPr>
+          <w:p>
+            <w:r/>
+            <w:r>
+              <w:rPr>
+                <w:b w:val="0"/>
+                <w:sz w:val="18"/>
+              </w:rPr>
+              <w:t>Not done — needs browser + backend (§12.6)</w:t>
+            </w:r>
+          </w:p>
+        </w:tc>
+      </w:tr>
+      <w:tr>
+        <w:tc>
+          <w:tcPr>
+            <w:tcW w:type="dxa" w:w="4320"/>
+          </w:tcPr>
+          <w:p>
+            <w:r/>
+            <w:r>
+              <w:rPr>
+                <w:b w:val="0"/>
+                <w:sz w:val="18"/>
+              </w:rPr>
+              <w:t>Automatic roll (drain-less frames)</w:t>
+            </w:r>
+          </w:p>
+        </w:tc>
+        <w:tc>
+          <w:tcPr>
+            <w:tcW w:type="dxa" w:w="4320"/>
+          </w:tcPr>
+          <w:p>
+            <w:r/>
+            <w:r>
+              <w:rPr>
+                <w:b w:val="0"/>
+                <w:sz w:val="18"/>
+              </w:rPr>
+              <w:t>Not built — manual dials only</w:t>
+            </w:r>
+          </w:p>
+        </w:tc>
+      </w:tr>
+      <w:tr>
+        <w:tc>
+          <w:tcPr>
+            <w:tcW w:type="dxa" w:w="4320"/>
+          </w:tcPr>
+          <w:p>
+            <w:r/>
+            <w:r>
+              <w:rPr>
+                <w:b w:val="0"/>
+                <w:sz w:val="18"/>
+              </w:rPr>
+              <w:t>Persistence / report flow</w:t>
+            </w:r>
+          </w:p>
+        </w:tc>
+        <w:tc>
+          <w:tcPr>
+            <w:tcW w:type="dxa" w:w="4320"/>
+          </w:tcPr>
+          <w:p>
+            <w:r/>
+            <w:r>
+              <w:rPr>
+                <w:b w:val="0"/>
+                <w:sz w:val="18"/>
+              </w:rPr>
+              <w:t>Deferred by design</w:t>
+            </w:r>
+          </w:p>
+        </w:tc>
+      </w:tr>
+      <w:tr>
+        <w:tc>
+          <w:tcPr>
+            <w:tcW w:type="dxa" w:w="4320"/>
+          </w:tcPr>
+          <w:p>
+            <w:r/>
+            <w:r>
+              <w:rPr>
+                <w:b w:val="0"/>
+                <w:sz w:val="18"/>
+              </w:rPr>
+              <w:t>Auto-detect gratings</w:t>
+            </w:r>
+          </w:p>
+        </w:tc>
+        <w:tc>
+          <w:tcPr>
+            <w:tcW w:type="dxa" w:w="4320"/>
+          </w:tcPr>
+          <w:p>
+            <w:r/>
+            <w:r>
+              <w:rPr>
+                <w:b w:val="0"/>
+                <w:sz w:val="18"/>
+              </w:rPr>
+              <w:t>Future (manual click for now)</w:t>
+            </w:r>
+          </w:p>
+        </w:tc>
+      </w:tr>
+    </w:tbl>
+    <w:p>
+      <w:pPr>
+        <w:pStyle w:val="Heading2"/>
+      </w:pPr>
+      <w:r/>
+      <w:r>
+        <w:t>12.3 Architecture</w:t>
+      </w:r>
+    </w:p>
+    <w:p>
+      <w:r>
+        <w:t>Frontend-only. No backend changes — calibration constants are fixed and baked into the frontend; persistence is deferred, so nothing is written.</w:t>
+      </w:r>
+    </w:p>
+    <w:p>
+      <w:pPr>
+        <w:spacing w:before="80" w:after="80"/>
+        <w:ind w:left="432"/>
+        <w:shd w:val="clear" w:color="auto" w:fill="1A202C"/>
+      </w:pPr>
+      <w:r>
+        <w:rPr>
+          <w:rFonts w:ascii="Courier New" w:hAnsi="Courier New"/>
+          <w:color w:val="F1F5F9"/>
+          <w:sz w:val="18"/>
+        </w:rPr>
+        <w:t xml:space="preserve">frontend/src/pages/CodingPage/components/</w:t>
+        <w:br/>
+        <w:t xml:space="preserve">+- ImagePanel.tsx           &lt;- adds the "Measure" button (reused by v1 AND v2 layouts)</w:t>
+        <w:br/>
+        <w:t xml:space="preserve">+- MeasureMode/</w:t>
+        <w:br/>
+        <w:t xml:space="preserve">   +- measureMath.ts        &lt;- PURE geometry. Single source of truth for rig constants.</w:t>
+        <w:br/>
+        <w:t xml:space="preserve">   +- MeasureModal.tsx      &lt;- the tool: portal modal, canvas overlay, dials, read-off</w:t>
+      </w:r>
+    </w:p>
+    <w:p>
+      <w:r>
+        <w:rPr>
+          <w:b/>
+        </w:rPr>
+        <w:t>Why it hangs off `ImagePanel`:</w:t>
+      </w:r>
+      <w:r>
+        <w:t xml:space="preserve"> </w:t>
+      </w:r>
+      <w:r>
+        <w:rPr>
+          <w:rFonts w:ascii="Courier New" w:hAnsi="Courier New"/>
+          <w:color w:val="C53030"/>
+          <w:sz w:val="18"/>
+        </w:rPr>
+        <w:t>ImagePanel</w:t>
+      </w:r>
+      <w:r>
+        <w:t xml:space="preserve"> is the per-segment street-view component, reused by both the v1 and v2 Coding layouts. Adding the button there makes the tool appear in both with zero changes to layout chrome — respecting the v2 container/shell seam (see §11: UI Design Principles).</w:t>
+      </w:r>
+    </w:p>
+    <w:p>
+      <w:r>
+        <w:rPr>
+          <w:b/>
+        </w:rPr>
+        <w:t>Why a portal modal, not a Chakra Dialog:</w:t>
+      </w:r>
+      <w:r>
+        <w:t xml:space="preserve"> Chakra/Zag </w:t>
+      </w:r>
+      <w:r>
+        <w:rPr>
+          <w:rFonts w:ascii="Courier New" w:hAnsi="Courier New"/>
+          <w:color w:val="C53030"/>
+          <w:sz w:val="18"/>
+        </w:rPr>
+        <w:t>Dialog</w:t>
+      </w:r>
+      <w:r>
+        <w:t xml:space="preserve"> has a documented pointer-events freeze-after-close bug (see the root </w:t>
+      </w:r>
+      <w:r>
+        <w:rPr>
+          <w:rFonts w:ascii="Courier New" w:hAnsi="Courier New"/>
+          <w:color w:val="C53030"/>
+          <w:sz w:val="18"/>
+        </w:rPr>
+        <w:t>CLAUDE.md</w:t>
+      </w:r>
+      <w:r>
+        <w:t xml:space="preserve">). </w:t>
+      </w:r>
+      <w:r>
+        <w:rPr>
+          <w:rFonts w:ascii="Courier New" w:hAnsi="Courier New"/>
+          <w:color w:val="C53030"/>
+          <w:sz w:val="18"/>
+        </w:rPr>
+        <w:t>MeasureModal</w:t>
+      </w:r>
+      <w:r>
+        <w:t xml:space="preserve"> renders via </w:t>
+      </w:r>
+      <w:r>
+        <w:rPr>
+          <w:rFonts w:ascii="Courier New" w:hAnsi="Courier New"/>
+          <w:color w:val="C53030"/>
+          <w:sz w:val="18"/>
+        </w:rPr>
+        <w:t>createPortal</w:t>
+      </w:r>
+      <w:r>
+        <w:t xml:space="preserve"> to </w:t>
+      </w:r>
+      <w:r>
+        <w:rPr>
+          <w:rFonts w:ascii="Courier New" w:hAnsi="Courier New"/>
+          <w:color w:val="C53030"/>
+          <w:sz w:val="18"/>
+        </w:rPr>
+        <w:t>document.body</w:t>
+      </w:r>
+      <w:r>
+        <w:t xml:space="preserve"> with a plain fixed overlay — no Zag, no freeze risk.</w:t>
+      </w:r>
+    </w:p>
+    <w:p>
+      <w:r>
+        <w:rPr>
+          <w:b/>
+        </w:rPr>
+        <w:t>v2 styling:</w:t>
+      </w:r>
+      <w:r>
+        <w:t xml:space="preserve"> the modal chrome follows the v2 design system, copied from the canonical v2 components rather than from the design guide text alone — overlay/panel/header/close match </w:t>
+      </w:r>
+      <w:r>
+        <w:rPr>
+          <w:rFonts w:ascii="Courier New" w:hAnsi="Courier New"/>
+          <w:color w:val="C53030"/>
+          <w:sz w:val="18"/>
+        </w:rPr>
+        <w:t>ConfirmDialogV2</w:t>
+      </w:r>
+      <w:r>
+        <w:t xml:space="preserve">, the anchor-type segmented control and selects/inputs match </w:t>
+      </w:r>
+      <w:r>
+        <w:rPr>
+          <w:rFonts w:ascii="Courier New" w:hAnsi="Courier New"/>
+          <w:color w:val="C53030"/>
+          <w:sz w:val="18"/>
+        </w:rPr>
+        <w:t>ShareProjectModalV2</w:t>
+      </w:r>
+      <w:r>
+        <w:t xml:space="preserve">, buttons mirror </w:t>
+      </w:r>
+      <w:r>
+        <w:rPr>
+          <w:rFonts w:ascii="Courier New" w:hAnsi="Courier New"/>
+          <w:color w:val="C53030"/>
+          <w:sz w:val="18"/>
+        </w:rPr>
+        <w:t>V2Btn</w:t>
+      </w:r>
+      <w:r>
+        <w:t xml:space="preserve">, all on </w:t>
+      </w:r>
+      <w:r>
+        <w:rPr>
+          <w:rFonts w:ascii="Courier New" w:hAnsi="Courier New"/>
+          <w:color w:val="C53030"/>
+          <w:sz w:val="18"/>
+        </w:rPr>
+        <w:t>designTokens</w:t>
+      </w:r>
+      <w:r>
+        <w:t xml:space="preserve"> </w:t>
+      </w:r>
+      <w:r>
+        <w:rPr>
+          <w:rFonts w:ascii="Courier New" w:hAnsi="Courier New"/>
+          <w:color w:val="C53030"/>
+          <w:sz w:val="18"/>
+        </w:rPr>
+        <w:t>COLOR</w:t>
+      </w:r>
+      <w:r>
+        <w:t>/</w:t>
+      </w:r>
+      <w:r>
+        <w:rPr>
+          <w:rFonts w:ascii="Courier New" w:hAnsi="Courier New"/>
+          <w:color w:val="C53030"/>
+          <w:sz w:val="18"/>
+        </w:rPr>
+        <w:t>FONT</w:t>
+      </w:r>
+      <w:r>
+        <w:t xml:space="preserve"> (light-only, no dark mode).</w:t>
+      </w:r>
+    </w:p>
+    <w:p>
+      <w:r>
+        <w:rPr>
+          <w:b/>
+        </w:rPr>
+        <w:t>Data flow:</w:t>
+      </w:r>
+    </w:p>
+    <w:p>
+      <w:r>
+        <w:rPr>
+          <w:b w:val="0"/>
+        </w:rPr>
+        <w:t xml:space="preserve">1. </w:t>
+      </w:r>
+      <w:r>
+        <w:t xml:space="preserve">Modal loads the frame from the same URL </w:t>
+      </w:r>
+      <w:r>
+        <w:rPr>
+          <w:rFonts w:ascii="Courier New" w:hAnsi="Courier New"/>
+          <w:color w:val="C53030"/>
+          <w:sz w:val="18"/>
+        </w:rPr>
+        <w:t>ImagePanel</w:t>
+      </w:r>
+      <w:r>
+        <w:t xml:space="preserve"> uses: </w:t>
+      </w:r>
+      <w:r>
+        <w:rPr>
+          <w:rFonts w:ascii="Courier New" w:hAnsi="Courier New"/>
+          <w:color w:val="C53030"/>
+          <w:sz w:val="18"/>
+        </w:rPr>
+        <w:t>/api/projects/&lt;project&gt;/images/&lt;imageRef&gt;</w:t>
+      </w:r>
+      <w:r>
+        <w:t xml:space="preserve"> (proxied to the backend on </w:t>
+      </w:r>
+      <w:r>
+        <w:rPr>
+          <w:rFonts w:ascii="Courier New" w:hAnsi="Courier New"/>
+          <w:color w:val="C53030"/>
+          <w:sz w:val="18"/>
+        </w:rPr>
+        <w:t>:8000</w:t>
+      </w:r>
+      <w:r>
+        <w:t>).</w:t>
+      </w:r>
+    </w:p>
+    <w:p>
+      <w:r>
+        <w:rPr>
+          <w:b w:val="0"/>
+        </w:rPr>
+        <w:t xml:space="preserve">2. </w:t>
+      </w:r>
+      <w:r>
+        <w:t xml:space="preserve">The image is drawn onto a </w:t>
+      </w:r>
+      <w:r>
+        <w:rPr>
+          <w:rFonts w:ascii="Courier New" w:hAnsi="Courier New"/>
+          <w:color w:val="C53030"/>
+          <w:sz w:val="18"/>
+        </w:rPr>
+        <w:t>&lt;canvas&gt;</w:t>
+      </w:r>
+      <w:r>
+        <w:t xml:space="preserve"> sized </w:t>
+      </w:r>
+      <w:r>
+        <w:rPr>
+          <w:rFonts w:ascii="Courier New" w:hAnsi="Courier New"/>
+          <w:color w:val="C53030"/>
+          <w:sz w:val="18"/>
+        </w:rPr>
+        <w:t>IMG_W·S × IMG_H·S</w:t>
+      </w:r>
+      <w:r>
+        <w:t xml:space="preserve"> (</w:t>
+      </w:r>
+      <w:r>
+        <w:rPr>
+          <w:rFonts w:ascii="Courier New" w:hAnsi="Courier New"/>
+          <w:color w:val="C53030"/>
+          <w:sz w:val="18"/>
+        </w:rPr>
+        <w:t>S</w:t>
+      </w:r>
+      <w:r>
+        <w:t xml:space="preserve"> = display scale). Because the component draws the image itself, the native-pixel ↔ display-pixel mapping is exact and known.</w:t>
+      </w:r>
+    </w:p>
+    <w:p>
+      <w:r>
+        <w:rPr>
+          <w:b w:val="0"/>
+        </w:rPr>
+        <w:t xml:space="preserve">3. </w:t>
+      </w:r>
+      <w:r>
+        <w:t xml:space="preserve">Clicks convert display px → native px, then native px → ground metres via </w:t>
+      </w:r>
+      <w:r>
+        <w:rPr>
+          <w:rFonts w:ascii="Courier New" w:hAnsi="Courier New"/>
+          <w:color w:val="C53030"/>
+          <w:sz w:val="18"/>
+        </w:rPr>
+        <w:t>measureMath</w:t>
+      </w:r>
+      <w:r>
+        <w:t>.</w:t>
+      </w:r>
+    </w:p>
+    <w:p>
+      <w:r>
+        <w:rPr>
+          <w:b w:val="0"/>
+        </w:rPr>
+        <w:t xml:space="preserve">4. </w:t>
+      </w:r>
+      <w:r>
+        <w:t xml:space="preserve">All overlay geometry is computed by </w:t>
+      </w:r>
+      <w:r>
+        <w:rPr>
+          <w:rFonts w:ascii="Courier New" w:hAnsi="Courier New"/>
+          <w:color w:val="C53030"/>
+          <w:sz w:val="18"/>
+        </w:rPr>
+        <w:t>measureMath</w:t>
+      </w:r>
+      <w:r>
+        <w:t xml:space="preserve"> and drawn on the canvas. Read-off is derived React state (no DOM poking).</w:t>
+      </w:r>
+    </w:p>
+    <w:p>
+      <w:r>
+        <w:rPr>
+          <w:b/>
+        </w:rPr>
+        <w:t>State (in `MeasureModal`):</w:t>
+      </w:r>
+      <w:r>
+        <w:t xml:space="preserve"> </w:t>
+      </w:r>
+      <w:r>
+        <w:rPr>
+          <w:rFonts w:ascii="Courier New" w:hAnsi="Courier New"/>
+          <w:color w:val="C53030"/>
+          <w:sz w:val="18"/>
+        </w:rPr>
+        <w:t>rig</w:t>
+      </w:r>
+      <w:r>
+        <w:t xml:space="preserve"> (the full projection state), </w:t>
+      </w:r>
+      <w:r>
+        <w:rPr>
+          <w:rFonts w:ascii="Courier New" w:hAnsi="Courier New"/>
+          <w:color w:val="C53030"/>
+          <w:sz w:val="18"/>
+        </w:rPr>
+        <w:t>mode</w:t>
+      </w:r>
+      <w:r>
+        <w:t xml:space="preserve"> (anchor/ruler), </w:t>
+      </w:r>
+      <w:r>
+        <w:rPr>
+          <w:rFonts w:ascii="Courier New" w:hAnsi="Courier New"/>
+          <w:color w:val="C53030"/>
+          <w:sz w:val="18"/>
+        </w:rPr>
+        <w:t>picks</w:t>
+      </w:r>
+      <w:r>
+        <w:t xml:space="preserve"> (ground points), </w:t>
+      </w:r>
+      <w:r>
+        <w:rPr>
+          <w:rFonts w:ascii="Courier New" w:hAnsi="Courier New"/>
+          <w:color w:val="C53030"/>
+          <w:sz w:val="18"/>
+        </w:rPr>
+        <w:t>anchorPts</w:t>
+      </w:r>
+      <w:r>
+        <w:t xml:space="preserve"> (clicked corners), </w:t>
+      </w:r>
+      <w:r>
+        <w:rPr>
+          <w:rFonts w:ascii="Courier New" w:hAnsi="Courier New"/>
+          <w:color w:val="C53030"/>
+          <w:sz w:val="18"/>
+        </w:rPr>
+        <w:t>anchorType</w:t>
+      </w:r>
+      <w:r>
+        <w:t xml:space="preserve"> (drain/tactile/custom). All size/type controls pass the size explicitly into </w:t>
+      </w:r>
+      <w:r>
+        <w:rPr>
+          <w:rFonts w:ascii="Courier New" w:hAnsi="Courier New"/>
+          <w:color w:val="C53030"/>
+          <w:sz w:val="18"/>
+        </w:rPr>
+        <w:t>doSolveAnchor</w:t>
+      </w:r>
+      <w:r>
+        <w:t xml:space="preserve"> — never read from state inside it (a stale-render bug, already fixed — do not reintroduce).</w:t>
+      </w:r>
+    </w:p>
+    <w:p>
+      <w:pPr>
+        <w:pStyle w:val="Heading2"/>
+      </w:pPr>
+      <w:r/>
+      <w:r>
+        <w:t>12.4 The math</w:t>
+      </w:r>
+    </w:p>
+    <w:p>
+      <w:r>
+        <w:t xml:space="preserve">All in </w:t>
+      </w:r>
+      <w:r>
+        <w:rPr>
+          <w:rFonts w:ascii="Courier New" w:hAnsi="Courier New"/>
+          <w:color w:val="C53030"/>
+          <w:sz w:val="18"/>
+        </w:rPr>
+        <w:t>measureMath.ts</w:t>
+      </w:r>
+      <w:r>
+        <w:t>, ported verbatim from a validated prototype and re-verified after the port (exact anchor solve to 6e-13 mm; px→ground→px round-trip exact over all 95,220 clickable pixels of the 18 test gratings).</w:t>
+      </w:r>
+    </w:p>
+    <w:p>
+      <w:r>
+        <w:rPr>
+          <w:b/>
+        </w:rPr>
+        <w:t>Coordinate frames:</w:t>
+      </w:r>
+      <w:r>
+        <w:t xml:space="preserve"> world x=right, y=forward (away from camera), z=up; camera X=right, Y=down, Z=forward. Ground plane is z=0.</w:t>
+      </w:r>
+    </w:p>
+    <w:p>
+      <w:r>
+        <w:rPr>
+          <w:b/>
+        </w:rPr>
+        <w:t>Two projection modes, same interface (`groundToPx` / `pxToGround`):</w:t>
+      </w:r>
+    </w:p>
+    <w:p>
+      <w:r>
+        <w:rPr>
+          <w:b w:val="0"/>
+        </w:rPr>
+        <w:t xml:space="preserve">1. </w:t>
+      </w:r>
+      <w:r>
+        <w:rPr>
+          <w:b/>
+        </w:rPr>
+        <w:t>Anchored (exact).</w:t>
+      </w:r>
+      <w:r>
+        <w:t xml:space="preserve"> Four clicked grating corners ↔ the known metric rectangle give a 3×3 homography (DLT + Gaussian elimination). This is the ground plane for that frame — no camera pose needed. </w:t>
+      </w:r>
+      <w:r>
+        <w:rPr>
+          <w:b/>
+        </w:rPr>
+        <w:t>Yaw</w:t>
+      </w:r>
+      <w:r>
+        <w:t xml:space="preserve"> is applied on top as a pure in-plane rotation so the grid starts aligned with the grating's side edge and the yaw dial means the same thing in the anchored and manual paths.</w:t>
+      </w:r>
+    </w:p>
+    <w:p>
+      <w:r>
+        <w:rPr>
+          <w:b w:val="0"/>
+        </w:rPr>
+        <w:t xml:space="preserve">2. </w:t>
+      </w:r>
+      <w:r>
+        <w:rPr>
+          <w:b/>
+        </w:rPr>
+        <w:t>Rig / manual (approximate).</w:t>
+      </w:r>
+      <w:r>
+        <w:t xml:space="preserve"> When there's no anchor, the projection uses the camera pose: height, pitch, roll, yaw + intrinsics. </w:t>
+      </w:r>
+      <w:r>
+        <w:rPr>
+          <w:rFonts w:ascii="Courier New" w:hAnsi="Courier New"/>
+          <w:color w:val="C53030"/>
+          <w:sz w:val="18"/>
+        </w:rPr>
+        <w:t>pxToGround</w:t>
+      </w:r>
+      <w:r>
+        <w:t xml:space="preserve"> undistorts, back-projects the ray, and intersects it with z=0.</w:t>
+      </w:r>
+    </w:p>
+    <w:p>
+      <w:r>
+        <w:rPr>
+          <w:b/>
+        </w:rPr>
+        <w:t>Lens distortion.</w:t>
+      </w:r>
+      <w:r>
+        <w:t xml:space="preserve"> A radial model </w:t>
+      </w:r>
+      <w:r>
+        <w:rPr>
+          <w:rFonts w:ascii="Courier New" w:hAnsi="Courier New"/>
+          <w:color w:val="C53030"/>
+          <w:sz w:val="18"/>
+        </w:rPr>
+        <w:t>r·(1 + k1·r² + k2·r⁴)</w:t>
+      </w:r>
+      <w:r>
+        <w:t>. The inverse (distorted → ideal) is solved by bisection on the radius, clamped to the model's monotonic domain — this replaced a fixed-point iteration that diverged under some coefficients; do not revert it.</w:t>
+      </w:r>
+    </w:p>
+    <w:p>
+      <w:r>
+        <w:rPr>
+          <w:b/>
+        </w:rPr>
+        <w:t>Clipping (toward-viewer grid).</w:t>
+      </w:r>
+      <w:r>
+        <w:t xml:space="preserve"> </w:t>
+      </w:r>
+      <w:r>
+        <w:rPr>
+          <w:rFonts w:ascii="Courier New" w:hAnsi="Courier New"/>
+          <w:color w:val="C53030"/>
+          <w:sz w:val="18"/>
+        </w:rPr>
+        <w:t>solveAnchor</w:t>
+      </w:r>
+      <w:r>
+        <w:t xml:space="preserve"> sign-normalises </w:t>
+      </w:r>
+      <w:r>
+        <w:rPr>
+          <w:rFonts w:ascii="Courier New" w:hAnsi="Courier New"/>
+          <w:color w:val="C53030"/>
+          <w:sz w:val="18"/>
+        </w:rPr>
+        <w:t>H</w:t>
+      </w:r>
+      <w:r>
+        <w:t>/</w:t>
+      </w:r>
+      <w:r>
+        <w:rPr>
+          <w:rFonts w:ascii="Courier New" w:hAnsi="Courier New"/>
+          <w:color w:val="C53030"/>
+          <w:sz w:val="18"/>
+        </w:rPr>
+        <w:t>Hinv</w:t>
+      </w:r>
+      <w:r>
+        <w:t xml:space="preserve"> so the homography's w-row is positive in front of the camera; </w:t>
+      </w:r>
+      <w:r>
+        <w:rPr>
+          <w:rFonts w:ascii="Courier New" w:hAnsi="Courier New"/>
+          <w:color w:val="C53030"/>
+          <w:sz w:val="18"/>
+        </w:rPr>
+        <w:t>groundToPx</w:t>
+      </w:r>
+      <w:r>
+        <w:t xml:space="preserve"> then returns null for behind-camera points instead of wrapping them through the horizon.</w:t>
+      </w:r>
+    </w:p>
+    <w:p>
+      <w:r>
+        <w:rPr>
+          <w:b/>
+        </w:rPr>
+        <w:t>Decomposition.</w:t>
+      </w:r>
+      <w:r>
+        <w:t xml:space="preserve"> When you anchor, the homography is decomposed back into pose (height/pitch/roll/yaw) purely to seed the dials for display. The exact matrix keeps driving the projection while untouched; only if you move pitch/height/roll does it fall back to the pose path (which costs ~35 mm).</w:t>
+      </w:r>
+    </w:p>
+    <w:p>
+      <w:r>
+        <w:t>*Layman's explanation: the tool finds a mathematical formula that converts “where a pixel is in the photo” into “how many metres away that point is on the ground,” using a known-size object (like a drain cover) in the photo as a ruler. Once it has that formula, it can measure the gap between the path edge and any obstacle just by where they appear in the picture.*</w:t>
+      </w:r>
+    </w:p>
+    <w:p>
+      <w:pPr>
+        <w:pStyle w:val="Heading2"/>
+      </w:pPr>
+      <w:r/>
+      <w:r>
+        <w:t>12.5 Calibration constants</w:t>
+      </w:r>
+    </w:p>
+    <w:p>
+      <w:r>
+        <w:rPr>
+          <w:b/>
+        </w:rPr>
+        <w:t>These are the single most important thing for the next engineer to understand, and the least finished.</w:t>
+      </w:r>
+    </w:p>
+    <w:p>
+      <w:r>
+        <w:t xml:space="preserve">All rig constants live in one place: the top of </w:t>
+      </w:r>
+      <w:r>
+        <w:rPr>
+          <w:rFonts w:ascii="Courier New" w:hAnsi="Courier New"/>
+          <w:color w:val="C53030"/>
+          <w:sz w:val="18"/>
+        </w:rPr>
+        <w:t>measureMath.ts</w:t>
+      </w:r>
+      <w:r>
+        <w:t>:</w:t>
+      </w:r>
+    </w:p>
+    <w:p>
+      <w:pPr>
+        <w:spacing w:before="80" w:after="80"/>
+        <w:ind w:left="432"/>
+        <w:shd w:val="clear" w:color="auto" w:fill="1A202C"/>
+      </w:pPr>
+      <w:r>
+        <w:rPr>
+          <w:rFonts w:ascii="Courier New" w:hAnsi="Courier New"/>
+          <w:color w:val="F1F5F9"/>
+          <w:sz w:val="18"/>
+        </w:rPr>
+        <w:t xml:space="preserve">export const INTRINSICS   = { fx: 233.34, fy: 233.34, cx: 320, cy: 228.5, k1: -0.045, k2: 0 };</w:t>
+        <w:br/>
+        <w:t xml:space="preserve">export const DEFAULT_HEIGHT = 0.725;   // metres</w:t>
+        <w:br/>
+        <w:t xml:space="preserve">export const DEFAULT_PITCH  = 2.18;    // degrees down</w:t>
+      </w:r>
+    </w:p>
+    <w:p>
+      <w:r>
+        <w:rPr>
+          <w:b/>
+        </w:rPr>
+        <w:t>Provenance (why these numbers):</w:t>
+      </w:r>
+    </w:p>
+    <w:p>
+      <w:pPr>
+        <w:pStyle w:val="ListBullet"/>
+      </w:pPr>
+      <w:r>
+        <w:t>Recovered from the imagery itself — there is no camera spec, no EXIF, no known mount height. Focal &amp; distortion came from a bundle adjustment over 18 hand-clicked gratings, then refined against path-edge geometry; height was hand-tuned against a path of known width.</w:t>
+      </w:r>
+    </w:p>
+    <w:p>
+      <w:pPr>
+        <w:pStyle w:val="ListBullet"/>
+      </w:pPr>
+      <w:r>
+        <w:t>They are plausible and self-consistent, but not authoritative. Two automated fits disagreed (a grating-only fit and a path-edge fit) and the truth was tuned between them.</w:t>
+      </w:r>
+    </w:p>
+    <w:p>
+      <w:r>
+        <w:rPr>
+          <w:b/>
+        </w:rPr>
+        <w:t>How to re-derive</w:t>
+      </w:r>
+      <w:r>
+        <w:t xml:space="preserve"> (scripts in repo root </w:t>
+      </w:r>
+      <w:r>
+        <w:rPr>
+          <w:rFonts w:ascii="Courier New" w:hAnsi="Courier New"/>
+          <w:color w:val="C53030"/>
+          <w:sz w:val="18"/>
+        </w:rPr>
+        <w:t>scripts/</w:t>
+      </w:r>
+      <w:r>
+        <w:t>, temp — see §12.7):</w:t>
+      </w:r>
+    </w:p>
+    <w:p>
+      <w:pPr>
+        <w:pStyle w:val="ListBullet"/>
+      </w:pPr>
+      <w:r>
+        <w:rPr>
+          <w:rFonts w:ascii="Courier New" w:hAnsi="Courier New"/>
+          <w:color w:val="C53030"/>
+          <w:sz w:val="18"/>
+        </w:rPr>
+        <w:t>TEMP_grating_clicker.py</w:t>
+      </w:r>
+      <w:r>
+        <w:t xml:space="preserve"> — click grating corners on frames → </w:t>
+      </w:r>
+      <w:r>
+        <w:rPr>
+          <w:rFonts w:ascii="Courier New" w:hAnsi="Courier New"/>
+          <w:color w:val="C53030"/>
+          <w:sz w:val="18"/>
+        </w:rPr>
+        <w:t>temp/grating_anchors.json</w:t>
+      </w:r>
+      <w:r>
+        <w:t>.</w:t>
+      </w:r>
+    </w:p>
+    <w:p>
+      <w:pPr>
+        <w:pStyle w:val="ListBullet"/>
+      </w:pPr>
+      <w:r>
+        <w:rPr>
+          <w:rFonts w:ascii="Courier New" w:hAnsi="Courier New"/>
+          <w:color w:val="C53030"/>
+          <w:sz w:val="18"/>
+        </w:rPr>
+        <w:t>calibrate_rig_from_anchors.py</w:t>
+      </w:r>
+      <w:r>
+        <w:t xml:space="preserve"> — bundle-adjust intrinsics + height/pitch from those anchors. Has a physical-plausibility guard — do not remove it.</w:t>
+      </w:r>
+    </w:p>
+    <w:p>
+      <w:pPr>
+        <w:pStyle w:val="ListBullet"/>
+      </w:pPr>
+      <w:r>
+        <w:rPr>
+          <w:rFonts w:ascii="Courier New" w:hAnsi="Courier New"/>
+          <w:color w:val="C53030"/>
+          <w:sz w:val="18"/>
+        </w:rPr>
+        <w:t>calibrate_from_path_edges.py</w:t>
+      </w:r>
+      <w:r>
+        <w:t xml:space="preserve"> — refine pitch/distortion from path-edge parallelism.</w:t>
+      </w:r>
+    </w:p>
+    <w:p>
+      <w:r>
+        <w:rPr>
+          <w:b/>
+        </w:rPr>
+        <w:t>When the rig is confirmed</w:t>
+      </w:r>
+      <w:r>
+        <w:t xml:space="preserve"> (or if a real mount height is ever measured), update the three constants above — that's the only change needed; everything downstream reads from them.</w:t>
+      </w:r>
+    </w:p>
+    <w:p>
+      <w:r>
+        <w:rPr>
+          <w:b/>
+        </w:rPr>
+        <w:t>Important:</w:t>
+      </w:r>
+      <w:r>
+        <w:t xml:space="preserve"> the anchor (drain) workflow re-derives the geometry from the scene every frame, so it is immune to these constants being slightly off. The constants only matter for the manual/drain-less path.</w:t>
+      </w:r>
+    </w:p>
+    <w:p>
+      <w:pPr>
+        <w:pStyle w:val="Heading2"/>
+      </w:pPr>
+      <w:r/>
+      <w:r>
+        <w:t>12.6 Known issues &amp; open work</w:t>
+      </w:r>
+    </w:p>
+    <w:p>
+      <w:r>
+        <w:rPr>
+          <w:b/>
+        </w:rPr>
+        <w:t>Do first — the one unverified thing:</w:t>
+      </w:r>
+      <w:r>
+        <w:t xml:space="preserve"> the math and build are proven, but nobody has opened the modal on a real segment in a browser and clicked through it. Run backend (</w:t>
+      </w:r>
+      <w:r>
+        <w:rPr>
+          <w:rFonts w:ascii="Courier New" w:hAnsi="Courier New"/>
+          <w:color w:val="C53030"/>
+          <w:sz w:val="18"/>
+        </w:rPr>
+        <w:t>:8000</w:t>
+      </w:r>
+      <w:r>
+        <w:t xml:space="preserve">) + </w:t>
+      </w:r>
+      <w:r>
+        <w:rPr>
+          <w:rFonts w:ascii="Courier New" w:hAnsi="Courier New"/>
+          <w:color w:val="C53030"/>
+          <w:sz w:val="18"/>
+        </w:rPr>
+        <w:t>cd frontend &amp;&amp; npm run dev</w:t>
+      </w:r>
+      <w:r>
+        <w:t>, open a segment on the Coding page, hit Measure, click a drain's 4 corners, and confirm the grid lands and measurements read true. This is the gate before anyone trusts it.</w:t>
+      </w:r>
+    </w:p>
+    <w:p>
+      <w:r>
+        <w:rPr>
+          <w:b/>
+        </w:rPr>
+        <w:t>Coverage — the big functional gap:</w:t>
+      </w:r>
+      <w:r>
+        <w:t xml:space="preserve"> automatic roll for drain-less frames is not built. Roll (bike lean) varies ±20° frame to frame and is the one parameter that can't be a constant. The correct approaches, in order of promise:</w:t>
+      </w:r>
+    </w:p>
+    <w:p>
+      <w:r>
+        <w:rPr>
+          <w:b w:val="0"/>
+        </w:rPr>
+        <w:t xml:space="preserve">1. </w:t>
+      </w:r>
+      <w:r>
+        <w:rPr>
+          <w:b/>
+        </w:rPr>
+        <w:t>Path-edge vanishing point</w:t>
+      </w:r>
+      <w:r>
+        <w:t xml:space="preserve"> — the path segmentation model already segments path edges in ~every frame; with pitch known as a constant, one horizon point pins roll. Best coverage.</w:t>
+      </w:r>
+    </w:p>
+    <w:p>
+      <w:r>
+        <w:rPr>
+          <w:b w:val="0"/>
+        </w:rPr>
+        <w:t xml:space="preserve">2. </w:t>
+      </w:r>
+      <w:r>
+        <w:rPr>
+          <w:b/>
+        </w:rPr>
+        <w:t>Vertical VP via RANSAC</w:t>
+      </w:r>
+      <w:r>
+        <w:t xml:space="preserve"> — fixes a real averaging bug from the first attempt, but the cue is absent in ~20% of frames (open park), so it can't stand alone.</w:t>
+      </w:r>
+    </w:p>
+    <w:p>
+      <w:r>
+        <w:rPr>
+          <w:b/>
+        </w:rPr>
+        <w:t>Accuracy refinements:</w:t>
+      </w:r>
+    </w:p>
+    <w:p>
+      <w:pPr>
+        <w:pStyle w:val="ListBullet"/>
+      </w:pPr>
+      <w:r>
+        <w:t>Per-frame height/pitch freedom — ~11% of frames carry larger error because bike lean also lowers and tilts the camera, but the model currently lets only roll vary.</w:t>
+      </w:r>
+    </w:p>
+    <w:p>
+      <w:pPr>
+        <w:pStyle w:val="ListBullet"/>
+      </w:pPr>
+      <w:r>
+        <w:t>Confirm/replace the calibration constants once the rig is verified (see §12.5).</w:t>
+      </w:r>
+    </w:p>
+    <w:p>
+      <w:r>
+        <w:rPr>
+          <w:b/>
+        </w:rPr>
+        <w:t>Productisation:</w:t>
+      </w:r>
+    </w:p>
+    <w:p>
+      <w:pPr>
+        <w:pStyle w:val="ListBullet"/>
+      </w:pPr>
+      <w:r>
+        <w:rPr>
+          <w:b/>
+        </w:rPr>
+        <w:t>Custom known-size anchors — shipped</w:t>
+      </w:r>
+      <w:r>
+        <w:t xml:space="preserve"> (basic version): Drain / Tactile / Custom anchor types. Remaining follow-ups: a user-managed list of saved reference objects, and additional presets.</w:t>
+      </w:r>
+    </w:p>
+    <w:p>
+      <w:pPr>
+        <w:pStyle w:val="ListBullet"/>
+      </w:pPr>
+      <w:r>
+        <w:rPr>
+          <w:b/>
+        </w:rPr>
+        <w:t>Persistence</w:t>
+      </w:r>
+      <w:r>
+        <w:t xml:space="preserve"> — architected-for but deferred. Save the ruler read-off (clear width L/R) onto the segment and flow it into reports.</w:t>
+      </w:r>
+    </w:p>
+    <w:p>
+      <w:pPr>
+        <w:pStyle w:val="ListBullet"/>
+      </w:pPr>
+      <w:r>
+        <w:rPr>
+          <w:b/>
+        </w:rPr>
+        <w:t>Auto-detect gratings</w:t>
+      </w:r>
+      <w:r>
+        <w:t xml:space="preserve"> — a YOLO class for the standard 850×700 grating, removing the manual 4-click.</w:t>
+      </w:r>
+    </w:p>
+    <w:p>
+      <w:pPr>
+        <w:pStyle w:val="Heading2"/>
+      </w:pPr>
+      <w:r/>
+      <w:r>
+        <w:t>12.7 Temp artefacts</w:t>
+      </w:r>
+    </w:p>
+    <w:p>
+      <w:r>
+        <w:t xml:space="preserve">Tracked in full in </w:t>
+      </w:r>
+      <w:r>
+        <w:rPr>
+          <w:rFonts w:ascii="Courier New" w:hAnsi="Courier New"/>
+          <w:color w:val="C53030"/>
+          <w:sz w:val="18"/>
+        </w:rPr>
+        <w:t>temp/IN_IMAGE_METROLOGY_FEATURE.md</w:t>
+      </w:r>
+      <w:r>
+        <w:t>. Summary:</w:t>
+      </w:r>
+    </w:p>
+    <w:tbl>
+      <w:tblPr>
+        <w:tblStyle w:val="TableGrid"/>
+        <w:tblW w:type="auto" w:w="0"/>
+        <w:tblLook w:firstColumn="1" w:firstRow="1" w:lastColumn="0" w:lastRow="0" w:noHBand="0" w:noVBand="1" w:val="04A0"/>
+      </w:tblPr>
+      <w:tblGrid>
+        <w:gridCol w:w="2880"/>
+        <w:gridCol w:w="2880"/>
+        <w:gridCol w:w="2880"/>
+      </w:tblGrid>
+      <w:tr>
+        <w:tc>
+          <w:tcPr>
+            <w:tcW w:type="dxa" w:w="2880"/>
+            <w:shd w:val="clear" w:color="auto" w:fill="EDF2F7"/>
+          </w:tcPr>
+          <w:p>
+            <w:r/>
+            <w:r>
+              <w:rPr>
+                <w:b/>
+                <w:sz w:val="18"/>
+              </w:rPr>
+              <w:t>Path</w:t>
+            </w:r>
+          </w:p>
+        </w:tc>
+        <w:tc>
+          <w:tcPr>
+            <w:tcW w:type="dxa" w:w="2880"/>
+            <w:shd w:val="clear" w:color="auto" w:fill="EDF2F7"/>
+          </w:tcPr>
+          <w:p>
+            <w:r/>
+            <w:r>
+              <w:rPr>
+                <w:b/>
+                <w:sz w:val="18"/>
+              </w:rPr>
+              <w:t>What</w:t>
+            </w:r>
+          </w:p>
+        </w:tc>
+        <w:tc>
+          <w:tcPr>
+            <w:tcW w:type="dxa" w:w="2880"/>
+            <w:shd w:val="clear" w:color="auto" w:fill="EDF2F7"/>
+          </w:tcPr>
+          <w:p>
+            <w:r/>
+            <w:r>
+              <w:rPr>
+                <w:b/>
+                <w:sz w:val="18"/>
+              </w:rPr>
+              <w:t>Remove when</w:t>
+            </w:r>
+          </w:p>
+        </w:tc>
+      </w:tr>
+      <w:tr>
+        <w:tc>
+          <w:tcPr>
+            <w:tcW w:type="dxa" w:w="2880"/>
+          </w:tcPr>
+          <w:p>
+            <w:r/>
+            <w:r>
+              <w:rPr>
+                <w:b w:val="0"/>
+                <w:sz w:val="18"/>
+              </w:rPr>
+              <w:t>scripts/TEMP_grating_clicker.py</w:t>
+            </w:r>
+          </w:p>
+        </w:tc>
+        <w:tc>
+          <w:tcPr>
+            <w:tcW w:type="dxa" w:w="2880"/>
+          </w:tcPr>
+          <w:p>
+            <w:r/>
+            <w:r>
+              <w:rPr>
+                <w:b w:val="0"/>
+                <w:sz w:val="18"/>
+              </w:rPr>
+              <w:t>Grating corner clicker</w:t>
+            </w:r>
+          </w:p>
+        </w:tc>
+        <w:tc>
+          <w:tcPr>
+            <w:tcW w:type="dxa" w:w="2880"/>
+          </w:tcPr>
+          <w:p>
+            <w:r/>
+            <w:r>
+              <w:rPr>
+                <w:b w:val="0"/>
+                <w:sz w:val="18"/>
+              </w:rPr>
+              <w:t>Calibration constants are final</w:t>
+            </w:r>
+          </w:p>
+        </w:tc>
+      </w:tr>
+      <w:tr>
+        <w:tc>
+          <w:tcPr>
+            <w:tcW w:type="dxa" w:w="2880"/>
+          </w:tcPr>
+          <w:p>
+            <w:r/>
+            <w:r>
+              <w:rPr>
+                <w:b w:val="0"/>
+                <w:sz w:val="18"/>
+              </w:rPr>
+              <w:t>scripts/calibrate_rig_from_anchors.py</w:t>
+            </w:r>
+          </w:p>
+        </w:tc>
+        <w:tc>
+          <w:tcPr>
+            <w:tcW w:type="dxa" w:w="2880"/>
+          </w:tcPr>
+          <w:p>
+            <w:r/>
+            <w:r>
+              <w:rPr>
+                <w:b w:val="0"/>
+                <w:sz w:val="18"/>
+              </w:rPr>
+              <w:t>Bundle-adjust calibration</w:t>
+            </w:r>
+          </w:p>
+        </w:tc>
+        <w:tc>
+          <w:tcPr>
+            <w:tcW w:type="dxa" w:w="2880"/>
+          </w:tcPr>
+          <w:p>
+            <w:r/>
+            <w:r>
+              <w:rPr>
+                <w:b w:val="0"/>
+                <w:sz w:val="18"/>
+              </w:rPr>
+              <w:t>Keep while rig may change</w:t>
+            </w:r>
+          </w:p>
+        </w:tc>
+      </w:tr>
+      <w:tr>
+        <w:tc>
+          <w:tcPr>
+            <w:tcW w:type="dxa" w:w="2880"/>
+          </w:tcPr>
+          <w:p>
+            <w:r/>
+            <w:r>
+              <w:rPr>
+                <w:b w:val="0"/>
+                <w:sz w:val="18"/>
+              </w:rPr>
+              <w:t>scripts/calibrate_from_path_edges.py</w:t>
+            </w:r>
+          </w:p>
+        </w:tc>
+        <w:tc>
+          <w:tcPr>
+            <w:tcW w:type="dxa" w:w="2880"/>
+          </w:tcPr>
+          <w:p>
+            <w:r/>
+            <w:r>
+              <w:rPr>
+                <w:b w:val="0"/>
+                <w:sz w:val="18"/>
+              </w:rPr>
+              <w:t>Path-edge refinement</w:t>
+            </w:r>
+          </w:p>
+        </w:tc>
+        <w:tc>
+          <w:tcPr>
+            <w:tcW w:type="dxa" w:w="2880"/>
+          </w:tcPr>
+          <w:p>
+            <w:r/>
+            <w:r>
+              <w:rPr>
+                <w:b w:val="0"/>
+                <w:sz w:val="18"/>
+              </w:rPr>
+              <w:t>Keep while rig may change</w:t>
+            </w:r>
+          </w:p>
+        </w:tc>
+      </w:tr>
+      <w:tr>
+        <w:tc>
+          <w:tcPr>
+            <w:tcW w:type="dxa" w:w="2880"/>
+          </w:tcPr>
+          <w:p>
+            <w:r/>
+            <w:r>
+              <w:rPr>
+                <w:b w:val="0"/>
+                <w:sz w:val="18"/>
+              </w:rPr>
+              <w:t>scripts/validate_roll_estimator.py</w:t>
+            </w:r>
+          </w:p>
+        </w:tc>
+        <w:tc>
+          <w:tcPr>
+            <w:tcW w:type="dxa" w:w="2880"/>
+          </w:tcPr>
+          <w:p>
+            <w:r/>
+            <w:r>
+              <w:rPr>
+                <w:b w:val="0"/>
+                <w:sz w:val="18"/>
+              </w:rPr>
+              <w:t>Proved auto-roll fails</w:t>
+            </w:r>
+          </w:p>
+        </w:tc>
+        <w:tc>
+          <w:tcPr>
+            <w:tcW w:type="dxa" w:w="2880"/>
+          </w:tcPr>
+          <w:p>
+            <w:r/>
+            <w:r>
+              <w:rPr>
+                <w:b w:val="0"/>
+                <w:sz w:val="18"/>
+              </w:rPr>
+              <w:t>Keep while auto-roll is on the table</w:t>
+            </w:r>
+          </w:p>
+        </w:tc>
+      </w:tr>
+      <w:tr>
+        <w:tc>
+          <w:tcPr>
+            <w:tcW w:type="dxa" w:w="2880"/>
+          </w:tcPr>
+          <w:p>
+            <w:r/>
+            <w:r>
+              <w:rPr>
+                <w:b w:val="0"/>
+                <w:sz w:val="18"/>
+              </w:rPr>
+              <w:t>temp/grating_anchors.json, temp/rig_calibration*.json</w:t>
+            </w:r>
+          </w:p>
+        </w:tc>
+        <w:tc>
+          <w:tcPr>
+            <w:tcW w:type="dxa" w:w="2880"/>
+          </w:tcPr>
+          <w:p>
+            <w:r/>
+            <w:r>
+              <w:rPr>
+                <w:b w:val="0"/>
+                <w:sz w:val="18"/>
+              </w:rPr>
+              <w:t>Calibration data/outputs</w:t>
+            </w:r>
+          </w:p>
+        </w:tc>
+        <w:tc>
+          <w:tcPr>
+            <w:tcW w:type="dxa" w:w="2880"/>
+          </w:tcPr>
+          <w:p>
+            <w:r/>
+            <w:r>
+              <w:rPr>
+                <w:b w:val="0"/>
+                <w:sz w:val="18"/>
+              </w:rPr>
+              <w:t>Once constants are baked &amp; final</w:t>
+            </w:r>
+          </w:p>
+        </w:tc>
+      </w:tr>
+    </w:tbl>
+    <w:p>
+      <w:r>
+        <w:rPr>
+          <w:b/>
+        </w:rPr>
+        <w:t>Production code (keep):</w:t>
+      </w:r>
+      <w:r>
+        <w:t xml:space="preserve"> everything under </w:t>
+      </w:r>
+      <w:r>
+        <w:rPr>
+          <w:rFonts w:ascii="Courier New" w:hAnsi="Courier New"/>
+          <w:color w:val="C53030"/>
+          <w:sz w:val="18"/>
+        </w:rPr>
+        <w:t>frontend/src/pages/CodingPage/components/MeasureMode/</w:t>
+      </w:r>
+      <w:r>
+        <w:t xml:space="preserve"> and the </w:t>
+      </w:r>
+      <w:r>
+        <w:rPr>
+          <w:rFonts w:ascii="Courier New" w:hAnsi="Courier New"/>
+          <w:color w:val="C53030"/>
+          <w:sz w:val="18"/>
+        </w:rPr>
+        <w:t>ImagePanel</w:t>
+      </w:r>
+      <w:r>
+        <w:t xml:space="preserve"> button.</w:t>
+      </w:r>
+    </w:p>
+    <w:p>
+      <w:pPr>
+        <w:pStyle w:val="Heading2"/>
+      </w:pPr>
+      <w:r/>
+      <w:r>
+        <w:t>12.8 References</w:t>
+      </w:r>
+    </w:p>
+    <w:p>
+      <w:pPr>
+        <w:pStyle w:val="ListBullet"/>
+      </w:pPr>
+      <w:r>
+        <w:rPr>
+          <w:b/>
+        </w:rPr>
+        <w:t>Design log (full history &amp; rationale):</w:t>
+      </w:r>
+      <w:r>
+        <w:t xml:space="preserve"> </w:t>
+      </w:r>
+      <w:r>
+        <w:rPr>
+          <w:rFonts w:ascii="Courier New" w:hAnsi="Courier New"/>
+          <w:color w:val="C53030"/>
+          <w:sz w:val="18"/>
+        </w:rPr>
+        <w:t>docs/in-image-metrology.md</w:t>
+      </w:r>
+      <w:r>
+        <w:t xml:space="preserve">, and </w:t>
+      </w:r>
+      <w:r>
+        <w:rPr>
+          <w:rFonts w:ascii="Courier New" w:hAnsi="Courier New"/>
+          <w:color w:val="C53030"/>
+          <w:sz w:val="18"/>
+        </w:rPr>
+        <w:t>temp/IN_IMAGE_METROLOGY_FEATURE.md</w:t>
+      </w:r>
+      <w:r>
+        <w:t xml:space="preserve"> for the day-by-day decision trail.</w:t>
+      </w:r>
+    </w:p>
+    <w:p>
+      <w:pPr>
+        <w:pStyle w:val="ListBullet"/>
+      </w:pPr>
+      <w:r>
+        <w:rPr>
+          <w:b/>
+        </w:rPr>
+        <w:t>Core math:</w:t>
+      </w:r>
+      <w:r>
+        <w:t xml:space="preserve"> </w:t>
+      </w:r>
+      <w:r>
+        <w:rPr>
+          <w:rFonts w:ascii="Courier New" w:hAnsi="Courier New"/>
+          <w:color w:val="C53030"/>
+          <w:sz w:val="18"/>
+        </w:rPr>
+        <w:t>frontend/src/pages/CodingPage/components/MeasureMode/measureMath.ts</w:t>
+      </w:r>
+    </w:p>
+    <w:p>
+      <w:pPr>
+        <w:pStyle w:val="ListBullet"/>
+      </w:pPr>
+      <w:r>
+        <w:rPr>
+          <w:b/>
+        </w:rPr>
+        <w:t>UI:</w:t>
+      </w:r>
+      <w:r>
+        <w:t xml:space="preserve"> </w:t>
+      </w:r>
+      <w:r>
+        <w:rPr>
+          <w:rFonts w:ascii="Courier New" w:hAnsi="Courier New"/>
+          <w:color w:val="C53030"/>
+          <w:sz w:val="18"/>
+        </w:rPr>
+        <w:t>frontend/src/pages/CodingPage/components/MeasureMode/MeasureModal.tsx</w:t>
+      </w:r>
+    </w:p>
+    <w:p>
+      <w:pPr>
+        <w:pStyle w:val="ListBullet"/>
+      </w:pPr>
+      <w:r>
+        <w:rPr>
+          <w:b/>
+        </w:rPr>
+        <w:t>Frontend v2 conventions:</w:t>
+      </w:r>
+      <w:r>
+        <w:t xml:space="preserve"> §11 UI Design Principles and the root </w:t>
+      </w:r>
+      <w:r>
+        <w:rPr>
+          <w:rFonts w:ascii="Courier New" w:hAnsi="Courier New"/>
+          <w:color w:val="C53030"/>
+          <w:sz w:val="18"/>
+        </w:rPr>
+        <w:t>frontend/CLAUDE.md</w:t>
+      </w:r>
+    </w:p>
+    <w:p>
+      <w:pPr>
+        <w:pStyle w:val="ListBullet"/>
+      </w:pPr>
+      <w:r>
+        <w:rPr>
+          <w:b/>
+        </w:rPr>
+        <w:t>Path segmentation model:</w:t>
+      </w:r>
+      <w:r>
+        <w:t xml:space="preserve"> </w:t>
+      </w:r>
+      <w:r>
+        <w:rPr>
+          <w:rFonts w:ascii="Courier New" w:hAnsi="Courier New"/>
+          <w:color w:val="C53030"/>
+          <w:sz w:val="18"/>
+        </w:rPr>
+        <w:t>backend/models/path_segmentation_6July.pt</w:t>
       </w:r>
     </w:p>
     <w:sectPr>

</xml_diff>